<commit_message>
Restore original bolvanki and simplify merge without renumbering.
Revert templates to pre-rebuild versions with fixed OZOTOBOS and
Stroyfinansgrupp titles, merge geodesy reports one file each, and drop
post-merge page header renumbering.

Co-authored-by: Cursor <cursoragent@cursor.com>
</commit_message>
<xml_diff>
--- a/data/templates/ОТ и ТБ.docx
+++ b/data/templates/ОТ и ТБ.docx
@@ -8,8 +8,7 @@
         <w:jc w:val="center"/>
         <w:rPr>
           <w:rFonts w:ascii="Times New Roman" w:hAnsi="Times New Roman" w:cs="Times New Roman"/>
-          <w:b w:val="1"/>
-          <w:bCs w:val="1"/>
+          <w:b/>
           <w:sz w:val="20"/>
           <w:szCs w:val="20"/>
         </w:rPr>
@@ -17,32 +16,11 @@
       <w:r>
         <w:rPr>
           <w:rFonts w:ascii="Times New Roman" w:hAnsi="Times New Roman" w:cs="Times New Roman"/>
-          <w:b w:val="1"/>
-          <w:bCs w:val="1"/>
+          <w:b/>
           <w:sz w:val="20"/>
           <w:szCs w:val="20"/>
         </w:rPr>
-        <w:t xml:space="preserve">Отчёт строительного контроля по </w:t>
-      </w:r>
-      <w:r>
-        <w:rPr>
-          <w:rFonts w:ascii="Times New Roman" w:hAnsi="Times New Roman" w:cs="Times New Roman"/>
-          <w:b w:val="1"/>
-          <w:bCs w:val="1"/>
-          <w:sz w:val="20"/>
-          <w:szCs w:val="20"/>
-        </w:rPr>
-        <w:t xml:space="preserve">ОЗОТОБОС </w:t>
-      </w:r>
-      <w:r>
-        <w:rPr>
-          <w:rFonts w:ascii="Times New Roman" w:hAnsi="Times New Roman" w:cs="Times New Roman"/>
-          <w:b w:val="1"/>
-          <w:bCs w:val="1"/>
-          <w:sz w:val="20"/>
-          <w:szCs w:val="20"/>
-        </w:rPr>
-        <w:t xml:space="preserve">за </w:t>
+        <w:t xml:space="preserve">Отчёт строительного контроля по ОЗОТОБОС за </w:t>
       </w:r>
     </w:p>
     <w:p>
@@ -58,9 +36,9 @@
       </w:pPr>
     </w:p>
     <w:sectPr>
-      <w:pgMar w:top="284" w:right="567" w:bottom="567" w:left="1134" w:header="284" w:footer="709" w:gutter="0"/>
       <w:headerReference w:type="default" r:id="rId8"/>
-      <w:pgSz w:w="11906" w:h="16838" w:orient="portrait"/>
+      <w:pgSz w:w="11906" w:h="16838"/>
+      <w:pgMar w:top="1843" w:right="567" w:bottom="567" w:left="1134" w:header="284" w:footer="709" w:gutter="0"/>
       <w:cols w:space="708"/>
       <w:docGrid w:linePitch="360"/>
     </w:sectPr>
@@ -119,19 +97,19 @@
 </file>
 
 <file path=word/header1.xml><?xml version="1.0" encoding="utf-8"?>
-<w:hdr xmlns:wpc="http://schemas.microsoft.com/office/word/2010/wordprocessingCanvas" xmlns:cx="http://schemas.microsoft.com/office/drawing/2014/chartex" xmlns:cx1="http://schemas.microsoft.com/office/drawing/2015/9/8/chartex" xmlns:cx2="http://schemas.microsoft.com/office/drawing/2015/10/21/chartex" xmlns:cx3="http://schemas.microsoft.com/office/drawing/2016/5/9/chartex" xmlns:cx4="http://schemas.microsoft.com/office/drawing/2016/5/10/chartex" xmlns:cx5="http://schemas.microsoft.com/office/drawing/2016/5/11/chartex" xmlns:cx6="http://schemas.microsoft.com/office/drawing/2016/5/12/chartex" xmlns:cx7="http://schemas.microsoft.com/office/drawing/2016/5/13/chartex" xmlns:cx8="http://schemas.microsoft.com/office/drawing/2016/5/14/chartex" xmlns:mc="http://schemas.openxmlformats.org/markup-compatibility/2006" xmlns:aink="http://schemas.microsoft.com/office/drawing/2016/ink" xmlns:am3d="http://schemas.microsoft.com/office/drawing/2017/model3d" xmlns:o="urn:schemas-microsoft-com:office:office" xmlns:oel="http://schemas.microsoft.com/office/2019/extlst" xmlns:r="http://schemas.openxmlformats.org/officeDocument/2006/relationships" xmlns:m="http://schemas.openxmlformats.org/officeDocument/2006/math" xmlns:v="urn:schemas-microsoft-com:vml" xmlns:wp14="http://schemas.microsoft.com/office/word/2010/wordprocessingDrawing" xmlns:wp="http://schemas.openxmlformats.org/drawingml/2006/wordprocessingDrawing" xmlns:w10="urn:schemas-microsoft-com:office:word" xmlns:w="http://schemas.openxmlformats.org/wordprocessingml/2006/main" xmlns:w14="http://schemas.microsoft.com/office/word/2010/wordml" xmlns:w15="http://schemas.microsoft.com/office/word/2012/wordml" xmlns:w16cex="http://schemas.microsoft.com/office/word/2018/wordml/cex" xmlns:w16cid="http://schemas.microsoft.com/office/word/2016/wordml/cid" xmlns:w16="http://schemas.microsoft.com/office/word/2018/wordml" xmlns:w16du="http://schemas.microsoft.com/office/word/2023/wordml/word16du" xmlns:w16sdtdh="http://schemas.microsoft.com/office/word/2020/wordml/sdtdatahash" xmlns:w16se="http://schemas.microsoft.com/office/word/2015/wordml/symex" xmlns:wpg="http://schemas.microsoft.com/office/word/2010/wordprocessingGroup" xmlns:wpi="http://schemas.microsoft.com/office/word/2010/wordprocessingInk" xmlns:wne="http://schemas.microsoft.com/office/word/2006/wordml" xmlns:wps="http://schemas.microsoft.com/office/word/2010/wordprocessingShape" xmlns:a="http://schemas.openxmlformats.org/drawingml/2006/main" xmlns:a16="http://schemas.microsoft.com/office/drawing/2014/main" xmlns:pic="http://schemas.openxmlformats.org/drawingml/2006/picture" xmlns:a14="http://schemas.microsoft.com/office/drawing/2010/main" mc:Ignorable="w14 w15 w16se w16cid w16 w16cex w16sdtdh w16du wp14">
+<w:hdr xmlns:wpc="http://schemas.microsoft.com/office/word/2010/wordprocessingCanvas" xmlns:cx="http://schemas.microsoft.com/office/drawing/2014/chartex" xmlns:cx1="http://schemas.microsoft.com/office/drawing/2015/9/8/chartex" xmlns:cx2="http://schemas.microsoft.com/office/drawing/2015/10/21/chartex" xmlns:cx3="http://schemas.microsoft.com/office/drawing/2016/5/9/chartex" xmlns:cx4="http://schemas.microsoft.com/office/drawing/2016/5/10/chartex" xmlns:cx5="http://schemas.microsoft.com/office/drawing/2016/5/11/chartex" xmlns:cx6="http://schemas.microsoft.com/office/drawing/2016/5/12/chartex" xmlns:cx7="http://schemas.microsoft.com/office/drawing/2016/5/13/chartex" xmlns:cx8="http://schemas.microsoft.com/office/drawing/2016/5/14/chartex" xmlns:mc="http://schemas.openxmlformats.org/markup-compatibility/2006" xmlns:aink="http://schemas.microsoft.com/office/drawing/2016/ink" xmlns:am3d="http://schemas.microsoft.com/office/drawing/2017/model3d" xmlns:o="urn:schemas-microsoft-com:office:office" xmlns:oel="http://schemas.microsoft.com/office/2019/extlst" xmlns:r="http://schemas.openxmlformats.org/officeDocument/2006/relationships" xmlns:m="http://schemas.openxmlformats.org/officeDocument/2006/math" xmlns:v="urn:schemas-microsoft-com:vml" xmlns:wp14="http://schemas.microsoft.com/office/word/2010/wordprocessingDrawing" xmlns:wp="http://schemas.openxmlformats.org/drawingml/2006/wordprocessingDrawing" xmlns:w10="urn:schemas-microsoft-com:office:word" xmlns:w="http://schemas.openxmlformats.org/wordprocessingml/2006/main" xmlns:w14="http://schemas.microsoft.com/office/word/2010/wordml" xmlns:w15="http://schemas.microsoft.com/office/word/2012/wordml" xmlns:w16cex="http://schemas.microsoft.com/office/word/2018/wordml/cex" xmlns:w16cid="http://schemas.microsoft.com/office/word/2016/wordml/cid" xmlns:w16="http://schemas.microsoft.com/office/word/2018/wordml" xmlns:w16du="http://schemas.microsoft.com/office/word/2023/wordml/word16du" xmlns:w16sdtdh="http://schemas.microsoft.com/office/word/2020/wordml/sdtdatahash" xmlns:w16se="http://schemas.microsoft.com/office/word/2015/wordml/symex" xmlns:wpg="http://schemas.microsoft.com/office/word/2010/wordprocessingGroup" xmlns:wpi="http://schemas.microsoft.com/office/word/2010/wordprocessingInk" xmlns:wne="http://schemas.microsoft.com/office/word/2006/wordml" xmlns:wps="http://schemas.microsoft.com/office/word/2010/wordprocessingShape" mc:Ignorable="w14 w15 w16se w16cid w16 w16cex w16sdtdh w16du wp14">
   <w:tbl>
     <w:tblPr>
       <w:tblStyle w:val="ab"/>
       <w:tblW w:w="10586" w:type="dxa"/>
       <w:tblInd w:w="-284" w:type="dxa"/>
       <w:tblBorders>
-        <w:top w:val="none" w:color="auto" w:sz="0" w:space="0"/>
-        <w:left w:val="none" w:color="auto" w:sz="0" w:space="0"/>
-        <w:bottom w:val="none" w:color="auto" w:sz="0" w:space="0"/>
-        <w:right w:val="none" w:color="auto" w:sz="0" w:space="0"/>
-        <w:insideH w:val="none" w:color="auto" w:sz="0" w:space="0"/>
-        <w:insideV w:val="none" w:color="auto" w:sz="0" w:space="0"/>
+        <w:top w:val="none" w:sz="0" w:space="0" w:color="auto"/>
+        <w:left w:val="none" w:sz="0" w:space="0" w:color="auto"/>
+        <w:bottom w:val="none" w:sz="0" w:space="0" w:color="auto"/>
+        <w:right w:val="none" w:sz="0" w:space="0" w:color="auto"/>
+        <w:insideH w:val="none" w:sz="0" w:space="0" w:color="auto"/>
+        <w:insideV w:val="none" w:sz="0" w:space="0" w:color="auto"/>
       </w:tblBorders>
       <w:tblCellMar>
         <w:left w:w="0" w:type="dxa"/>
@@ -1181,7 +1159,7 @@
         <w:ind w:left="720" w:hanging="360"/>
       </w:pPr>
       <w:rPr>
-        <w:rFonts w:hint="default" w:eastAsiaTheme="minorEastAsia"/>
+        <w:rFonts w:eastAsiaTheme="minorEastAsia" w:hint="default"/>
       </w:rPr>
     </w:lvl>
     <w:lvl w:ilvl="1" w:tplc="04190019" w:tentative="1">
@@ -3409,7 +3387,7 @@
   <w:docDefaults>
     <w:rPrDefault>
       <w:rPr>
-        <w:rFonts w:asciiTheme="minorHAnsi" w:hAnsiTheme="minorHAnsi" w:eastAsiaTheme="minorHAnsi" w:cstheme="minorBidi"/>
+        <w:rFonts w:asciiTheme="minorHAnsi" w:eastAsiaTheme="minorHAnsi" w:hAnsiTheme="minorHAnsi" w:cstheme="minorBidi"/>
         <w:sz w:val="22"/>
         <w:szCs w:val="22"/>
         <w:lang w:val="ru-RU" w:eastAsia="en-US" w:bidi="ar-SA"/>
@@ -3424,14 +3402,14 @@
   <w:latentStyles w:defLockedState="0" w:defUIPriority="99" w:defSemiHidden="0" w:defUnhideWhenUsed="0" w:defQFormat="0" w:count="376">
     <w:lsdException w:name="Normal" w:uiPriority="0" w:qFormat="1"/>
     <w:lsdException w:name="heading 1" w:qFormat="1"/>
-    <w:lsdException w:name="heading 2" w:uiPriority="9" w:semiHidden="1" w:unhideWhenUsed="1" w:qFormat="1"/>
-    <w:lsdException w:name="heading 3" w:uiPriority="9" w:semiHidden="1" w:unhideWhenUsed="1" w:qFormat="1"/>
-    <w:lsdException w:name="heading 4" w:uiPriority="9" w:semiHidden="1" w:unhideWhenUsed="1" w:qFormat="1"/>
-    <w:lsdException w:name="heading 5" w:uiPriority="9" w:semiHidden="1" w:unhideWhenUsed="1" w:qFormat="1"/>
-    <w:lsdException w:name="heading 6" w:uiPriority="9" w:semiHidden="1" w:unhideWhenUsed="1" w:qFormat="1"/>
-    <w:lsdException w:name="heading 7" w:uiPriority="9" w:semiHidden="1" w:unhideWhenUsed="1" w:qFormat="1"/>
-    <w:lsdException w:name="heading 8" w:uiPriority="9" w:semiHidden="1" w:unhideWhenUsed="1" w:qFormat="1"/>
-    <w:lsdException w:name="heading 9" w:uiPriority="9" w:semiHidden="1" w:unhideWhenUsed="1" w:qFormat="1"/>
+    <w:lsdException w:name="heading 2" w:semiHidden="1" w:uiPriority="9" w:unhideWhenUsed="1" w:qFormat="1"/>
+    <w:lsdException w:name="heading 3" w:semiHidden="1" w:uiPriority="9" w:unhideWhenUsed="1" w:qFormat="1"/>
+    <w:lsdException w:name="heading 4" w:semiHidden="1" w:uiPriority="9" w:unhideWhenUsed="1" w:qFormat="1"/>
+    <w:lsdException w:name="heading 5" w:semiHidden="1" w:uiPriority="9" w:unhideWhenUsed="1" w:qFormat="1"/>
+    <w:lsdException w:name="heading 6" w:semiHidden="1" w:uiPriority="9" w:unhideWhenUsed="1" w:qFormat="1"/>
+    <w:lsdException w:name="heading 7" w:semiHidden="1" w:uiPriority="9" w:unhideWhenUsed="1" w:qFormat="1"/>
+    <w:lsdException w:name="heading 8" w:semiHidden="1" w:uiPriority="9" w:unhideWhenUsed="1" w:qFormat="1"/>
+    <w:lsdException w:name="heading 9" w:semiHidden="1" w:uiPriority="9" w:unhideWhenUsed="1" w:qFormat="1"/>
     <w:lsdException w:name="index 1" w:semiHidden="1" w:unhideWhenUsed="1"/>
     <w:lsdException w:name="index 2" w:semiHidden="1" w:unhideWhenUsed="1"/>
     <w:lsdException w:name="index 3" w:semiHidden="1" w:unhideWhenUsed="1"/>
@@ -3441,22 +3419,22 @@
     <w:lsdException w:name="index 7" w:semiHidden="1" w:unhideWhenUsed="1"/>
     <w:lsdException w:name="index 8" w:semiHidden="1" w:unhideWhenUsed="1"/>
     <w:lsdException w:name="index 9" w:semiHidden="1" w:unhideWhenUsed="1"/>
-    <w:lsdException w:name="toc 1" w:uiPriority="39" w:semiHidden="1" w:unhideWhenUsed="1"/>
-    <w:lsdException w:name="toc 2" w:uiPriority="39" w:semiHidden="1" w:unhideWhenUsed="1"/>
-    <w:lsdException w:name="toc 3" w:uiPriority="39" w:semiHidden="1" w:unhideWhenUsed="1"/>
-    <w:lsdException w:name="toc 4" w:uiPriority="39" w:semiHidden="1" w:unhideWhenUsed="1"/>
-    <w:lsdException w:name="toc 5" w:uiPriority="39" w:semiHidden="1" w:unhideWhenUsed="1"/>
-    <w:lsdException w:name="toc 6" w:uiPriority="39" w:semiHidden="1" w:unhideWhenUsed="1"/>
-    <w:lsdException w:name="toc 7" w:uiPriority="39" w:semiHidden="1" w:unhideWhenUsed="1"/>
-    <w:lsdException w:name="toc 8" w:uiPriority="39" w:semiHidden="1" w:unhideWhenUsed="1"/>
-    <w:lsdException w:name="toc 9" w:uiPriority="39" w:semiHidden="1" w:unhideWhenUsed="1"/>
+    <w:lsdException w:name="toc 1" w:semiHidden="1" w:uiPriority="39" w:unhideWhenUsed="1"/>
+    <w:lsdException w:name="toc 2" w:semiHidden="1" w:uiPriority="39" w:unhideWhenUsed="1"/>
+    <w:lsdException w:name="toc 3" w:semiHidden="1" w:uiPriority="39" w:unhideWhenUsed="1"/>
+    <w:lsdException w:name="toc 4" w:semiHidden="1" w:uiPriority="39" w:unhideWhenUsed="1"/>
+    <w:lsdException w:name="toc 5" w:semiHidden="1" w:uiPriority="39" w:unhideWhenUsed="1"/>
+    <w:lsdException w:name="toc 6" w:semiHidden="1" w:uiPriority="39" w:unhideWhenUsed="1"/>
+    <w:lsdException w:name="toc 7" w:semiHidden="1" w:uiPriority="39" w:unhideWhenUsed="1"/>
+    <w:lsdException w:name="toc 8" w:semiHidden="1" w:uiPriority="39" w:unhideWhenUsed="1"/>
+    <w:lsdException w:name="toc 9" w:semiHidden="1" w:uiPriority="39" w:unhideWhenUsed="1"/>
     <w:lsdException w:name="Normal Indent" w:semiHidden="1" w:unhideWhenUsed="1"/>
     <w:lsdException w:name="footnote text" w:semiHidden="1" w:unhideWhenUsed="1"/>
     <w:lsdException w:name="annotation text" w:semiHidden="1" w:unhideWhenUsed="1"/>
     <w:lsdException w:name="header" w:semiHidden="1" w:unhideWhenUsed="1"/>
     <w:lsdException w:name="footer" w:semiHidden="1" w:unhideWhenUsed="1"/>
     <w:lsdException w:name="index heading" w:semiHidden="1" w:unhideWhenUsed="1"/>
-    <w:lsdException w:name="caption" w:uiPriority="35" w:semiHidden="1" w:unhideWhenUsed="1" w:qFormat="1"/>
+    <w:lsdException w:name="caption" w:semiHidden="1" w:uiPriority="35" w:unhideWhenUsed="1" w:qFormat="1"/>
     <w:lsdException w:name="table of figures" w:semiHidden="1" w:unhideWhenUsed="1"/>
     <w:lsdException w:name="envelope address" w:semiHidden="1" w:unhideWhenUsed="1"/>
     <w:lsdException w:name="envelope return" w:semiHidden="1" w:unhideWhenUsed="1"/>
@@ -3487,9 +3465,9 @@
     <w:lsdException w:name="Title" w:uiPriority="10" w:qFormat="1"/>
     <w:lsdException w:name="Closing" w:semiHidden="1" w:unhideWhenUsed="1"/>
     <w:lsdException w:name="Signature" w:semiHidden="1" w:unhideWhenUsed="1"/>
-    <w:lsdException w:name="Default Paragraph Font" w:uiPriority="1" w:semiHidden="1" w:unhideWhenUsed="1"/>
-    <w:lsdException w:name="Body Text" w:uiPriority="0" w:semiHidden="1" w:unhideWhenUsed="1" w:qFormat="1"/>
-    <w:lsdException w:name="Body Text Indent" w:uiPriority="0" w:semiHidden="1" w:unhideWhenUsed="1"/>
+    <w:lsdException w:name="Default Paragraph Font" w:semiHidden="1" w:uiPriority="1" w:unhideWhenUsed="1"/>
+    <w:lsdException w:name="Body Text" w:semiHidden="1" w:uiPriority="0" w:unhideWhenUsed="1" w:qFormat="1"/>
+    <w:lsdException w:name="Body Text Indent" w:semiHidden="1" w:uiPriority="0" w:unhideWhenUsed="1"/>
     <w:lsdException w:name="List Continue" w:semiHidden="1" w:unhideWhenUsed="1"/>
     <w:lsdException w:name="List Continue 2" w:semiHidden="1" w:unhideWhenUsed="1"/>
     <w:lsdException w:name="List Continue 3" w:semiHidden="1" w:unhideWhenUsed="1"/>
@@ -3512,7 +3490,7 @@
     <w:lsdException w:name="Strong" w:uiPriority="22" w:qFormat="1"/>
     <w:lsdException w:name="Emphasis" w:uiPriority="20" w:qFormat="1"/>
     <w:lsdException w:name="Document Map" w:semiHidden="1" w:unhideWhenUsed="1"/>
-    <w:lsdException w:name="Plain Text" w:uiPriority="0" w:semiHidden="1" w:unhideWhenUsed="1"/>
+    <w:lsdException w:name="Plain Text" w:semiHidden="1" w:uiPriority="0" w:unhideWhenUsed="1"/>
     <w:lsdException w:name="E-mail Signature" w:semiHidden="1" w:unhideWhenUsed="1"/>
     <w:lsdException w:name="HTML Top of Form" w:semiHidden="1" w:unhideWhenUsed="1"/>
     <w:lsdException w:name="HTML Bottom of Form" w:semiHidden="1" w:unhideWhenUsed="1"/>
@@ -3523,7 +3501,7 @@
     <w:lsdException w:name="HTML Code" w:semiHidden="1" w:unhideWhenUsed="1"/>
     <w:lsdException w:name="HTML Definition" w:semiHidden="1" w:unhideWhenUsed="1"/>
     <w:lsdException w:name="HTML Keyboard" w:semiHidden="1" w:unhideWhenUsed="1"/>
-    <w:lsdException w:name="HTML Preformatted" w:uiPriority="0" w:semiHidden="1" w:unhideWhenUsed="1"/>
+    <w:lsdException w:name="HTML Preformatted" w:semiHidden="1" w:uiPriority="0" w:unhideWhenUsed="1"/>
     <w:lsdException w:name="HTML Sample" w:semiHidden="1" w:unhideWhenUsed="1"/>
     <w:lsdException w:name="HTML Typewriter" w:semiHidden="1" w:unhideWhenUsed="1"/>
     <w:lsdException w:name="HTML Variable" w:semiHidden="1" w:unhideWhenUsed="1"/>
@@ -3687,8 +3665,8 @@
     <w:lsdException w:name="Subtle Reference" w:uiPriority="31" w:qFormat="1"/>
     <w:lsdException w:name="Intense Reference" w:uiPriority="32" w:qFormat="1"/>
     <w:lsdException w:name="Book Title" w:uiPriority="33" w:qFormat="1"/>
-    <w:lsdException w:name="Bibliography" w:uiPriority="37" w:semiHidden="1" w:unhideWhenUsed="1"/>
-    <w:lsdException w:name="TOC Heading" w:uiPriority="39" w:semiHidden="1" w:unhideWhenUsed="1" w:qFormat="1"/>
+    <w:lsdException w:name="Bibliography" w:semiHidden="1" w:uiPriority="37" w:unhideWhenUsed="1"/>
+    <w:lsdException w:name="TOC Heading" w:semiHidden="1" w:uiPriority="39" w:unhideWhenUsed="1" w:qFormat="1"/>
     <w:lsdException w:name="Plain Table 1" w:uiPriority="41"/>
     <w:lsdException w:name="Plain Table 2" w:uiPriority="42"/>
     <w:lsdException w:name="Plain Table 3" w:uiPriority="43"/>
@@ -3799,7 +3777,7 @@
     <w:lsdException w:name="Unresolved Mention" w:semiHidden="1" w:unhideWhenUsed="1"/>
     <w:lsdException w:name="Smart Link" w:semiHidden="1" w:unhideWhenUsed="1"/>
   </w:latentStyles>
-  <w:style w:type="paragraph" w:styleId="a" w:default="1">
+  <w:style w:type="paragraph" w:default="1" w:styleId="a">
     <w:name w:val="Normal"/>
     <w:qFormat/>
     <w:rsid w:val="00F004AE"/>
@@ -3823,7 +3801,7 @@
       <w:outlineLvl w:val="0"/>
     </w:pPr>
     <w:rPr>
-      <w:rFonts w:asciiTheme="majorHAnsi" w:hAnsiTheme="majorHAnsi" w:eastAsiaTheme="majorEastAsia" w:cstheme="majorBidi"/>
+      <w:rFonts w:asciiTheme="majorHAnsi" w:eastAsiaTheme="majorEastAsia" w:hAnsiTheme="majorHAnsi" w:cstheme="majorBidi"/>
       <w:color w:val="365F91" w:themeColor="accent1" w:themeShade="BF"/>
       <w:sz w:val="32"/>
       <w:szCs w:val="32"/>
@@ -3845,7 +3823,7 @@
       <w:outlineLvl w:val="1"/>
     </w:pPr>
     <w:rPr>
-      <w:rFonts w:asciiTheme="majorHAnsi" w:hAnsiTheme="majorHAnsi" w:eastAsiaTheme="majorEastAsia" w:cstheme="majorBidi"/>
+      <w:rFonts w:asciiTheme="majorHAnsi" w:eastAsiaTheme="majorEastAsia" w:hAnsiTheme="majorHAnsi" w:cstheme="majorBidi"/>
       <w:b/>
       <w:bCs/>
       <w:color w:val="4F81BD" w:themeColor="accent1"/>
@@ -3869,7 +3847,7 @@
       <w:outlineLvl w:val="2"/>
     </w:pPr>
     <w:rPr>
-      <w:rFonts w:asciiTheme="majorHAnsi" w:hAnsiTheme="majorHAnsi" w:eastAsiaTheme="majorEastAsia" w:cstheme="majorBidi"/>
+      <w:rFonts w:asciiTheme="majorHAnsi" w:eastAsiaTheme="majorEastAsia" w:hAnsiTheme="majorHAnsi" w:cstheme="majorBidi"/>
       <w:b/>
       <w:bCs/>
       <w:color w:val="4F81BD" w:themeColor="accent1"/>
@@ -3892,7 +3870,7 @@
       <w:outlineLvl w:val="3"/>
     </w:pPr>
     <w:rPr>
-      <w:rFonts w:asciiTheme="majorHAnsi" w:hAnsiTheme="majorHAnsi" w:eastAsiaTheme="majorEastAsia" w:cstheme="majorBidi"/>
+      <w:rFonts w:asciiTheme="majorHAnsi" w:eastAsiaTheme="majorEastAsia" w:hAnsiTheme="majorHAnsi" w:cstheme="majorBidi"/>
       <w:b/>
       <w:bCs/>
       <w:i/>
@@ -3917,7 +3895,7 @@
       <w:outlineLvl w:val="4"/>
     </w:pPr>
     <w:rPr>
-      <w:rFonts w:asciiTheme="majorHAnsi" w:hAnsiTheme="majorHAnsi" w:eastAsiaTheme="majorEastAsia" w:cstheme="majorBidi"/>
+      <w:rFonts w:asciiTheme="majorHAnsi" w:eastAsiaTheme="majorEastAsia" w:hAnsiTheme="majorHAnsi" w:cstheme="majorBidi"/>
       <w:color w:val="244061" w:themeColor="accent1" w:themeShade="80"/>
     </w:rPr>
   </w:style>
@@ -3938,7 +3916,7 @@
       <w:outlineLvl w:val="5"/>
     </w:pPr>
     <w:rPr>
-      <w:rFonts w:asciiTheme="majorHAnsi" w:hAnsiTheme="majorHAnsi" w:eastAsiaTheme="majorEastAsia" w:cstheme="majorBidi"/>
+      <w:rFonts w:asciiTheme="majorHAnsi" w:eastAsiaTheme="majorEastAsia" w:hAnsiTheme="majorHAnsi" w:cstheme="majorBidi"/>
       <w:i/>
       <w:iCs/>
       <w:color w:val="244061" w:themeColor="accent1" w:themeShade="80"/>
@@ -3961,7 +3939,7 @@
       <w:outlineLvl w:val="6"/>
     </w:pPr>
     <w:rPr>
-      <w:rFonts w:asciiTheme="majorHAnsi" w:hAnsiTheme="majorHAnsi" w:eastAsiaTheme="majorEastAsia" w:cstheme="majorBidi"/>
+      <w:rFonts w:asciiTheme="majorHAnsi" w:eastAsiaTheme="majorEastAsia" w:hAnsiTheme="majorHAnsi" w:cstheme="majorBidi"/>
       <w:i/>
       <w:iCs/>
       <w:color w:val="404040" w:themeColor="text1" w:themeTint="BF"/>
@@ -3984,7 +3962,7 @@
       <w:outlineLvl w:val="7"/>
     </w:pPr>
     <w:rPr>
-      <w:rFonts w:asciiTheme="majorHAnsi" w:hAnsiTheme="majorHAnsi" w:eastAsiaTheme="majorEastAsia" w:cstheme="majorBidi"/>
+      <w:rFonts w:asciiTheme="majorHAnsi" w:eastAsiaTheme="majorEastAsia" w:hAnsiTheme="majorHAnsi" w:cstheme="majorBidi"/>
       <w:color w:val="4F81BD" w:themeColor="accent1"/>
       <w:sz w:val="20"/>
       <w:szCs w:val="20"/>
@@ -4007,7 +3985,7 @@
       <w:outlineLvl w:val="8"/>
     </w:pPr>
     <w:rPr>
-      <w:rFonts w:asciiTheme="majorHAnsi" w:hAnsiTheme="majorHAnsi" w:eastAsiaTheme="majorEastAsia" w:cstheme="majorBidi"/>
+      <w:rFonts w:asciiTheme="majorHAnsi" w:eastAsiaTheme="majorEastAsia" w:hAnsiTheme="majorHAnsi" w:cstheme="majorBidi"/>
       <w:i/>
       <w:iCs/>
       <w:color w:val="404040" w:themeColor="text1" w:themeTint="BF"/>
@@ -4015,13 +3993,13 @@
       <w:szCs w:val="20"/>
     </w:rPr>
   </w:style>
-  <w:style w:type="character" w:styleId="a0" w:default="1">
+  <w:style w:type="character" w:default="1" w:styleId="a0">
     <w:name w:val="Default Paragraph Font"/>
     <w:uiPriority w:val="1"/>
     <w:semiHidden/>
     <w:unhideWhenUsed/>
   </w:style>
-  <w:style w:type="table" w:styleId="a1" w:default="1">
+  <w:style w:type="table" w:default="1" w:styleId="a1">
     <w:name w:val="Normal Table"/>
     <w:uiPriority w:val="99"/>
     <w:semiHidden/>
@@ -4036,7 +4014,7 @@
       </w:tblCellMar>
     </w:tblPr>
   </w:style>
-  <w:style w:type="numbering" w:styleId="a2" w:default="1">
+  <w:style w:type="numbering" w:default="1" w:styleId="a2">
     <w:name w:val="No List"/>
     <w:uiPriority w:val="99"/>
     <w:semiHidden/>
@@ -4060,7 +4038,7 @@
       <w:szCs w:val="16"/>
     </w:rPr>
   </w:style>
-  <w:style w:type="character" w:styleId="a4" w:customStyle="1">
+  <w:style w:type="character" w:customStyle="1" w:styleId="a4">
     <w:name w:val="Текст выноски Знак"/>
     <w:basedOn w:val="a0"/>
     <w:link w:val="a3"/>
@@ -4119,7 +4097,7 @@
       <w:lang w:eastAsia="en-US"/>
     </w:rPr>
   </w:style>
-  <w:style w:type="character" w:styleId="a8" w:customStyle="1">
+  <w:style w:type="character" w:customStyle="1" w:styleId="a8">
     <w:name w:val="Верхний колонтитул Знак"/>
     <w:basedOn w:val="a0"/>
     <w:link w:val="a7"/>
@@ -4141,14 +4119,14 @@
       <w:spacing w:after="0" w:line="240" w:lineRule="auto"/>
     </w:pPr>
   </w:style>
-  <w:style w:type="character" w:styleId="aa" w:customStyle="1">
+  <w:style w:type="character" w:customStyle="1" w:styleId="aa">
     <w:name w:val="Нижний колонтитул Знак"/>
     <w:basedOn w:val="a0"/>
     <w:link w:val="a9"/>
     <w:uiPriority w:val="99"/>
     <w:rsid w:val="00791605"/>
   </w:style>
-  <w:style w:type="character" w:styleId="apple-converted-space" w:customStyle="1">
+  <w:style w:type="character" w:customStyle="1" w:styleId="apple-converted-space">
     <w:name w:val="apple-converted-space"/>
     <w:basedOn w:val="a0"/>
     <w:rsid w:val="00C44687"/>
@@ -4163,12 +4141,12 @@
     </w:pPr>
     <w:tblPr>
       <w:tblBorders>
-        <w:top w:val="single" w:color="auto" w:sz="4" w:space="0"/>
-        <w:left w:val="single" w:color="auto" w:sz="4" w:space="0"/>
-        <w:bottom w:val="single" w:color="auto" w:sz="4" w:space="0"/>
-        <w:right w:val="single" w:color="auto" w:sz="4" w:space="0"/>
-        <w:insideH w:val="single" w:color="auto" w:sz="4" w:space="0"/>
-        <w:insideV w:val="single" w:color="auto" w:sz="4" w:space="0"/>
+        <w:top w:val="single" w:sz="4" w:space="0" w:color="auto"/>
+        <w:left w:val="single" w:sz="4" w:space="0" w:color="auto"/>
+        <w:bottom w:val="single" w:sz="4" w:space="0" w:color="auto"/>
+        <w:right w:val="single" w:sz="4" w:space="0" w:color="auto"/>
+        <w:insideH w:val="single" w:sz="4" w:space="0" w:color="auto"/>
+        <w:insideV w:val="single" w:sz="4" w:space="0" w:color="auto"/>
       </w:tblBorders>
     </w:tblPr>
   </w:style>
@@ -4195,32 +4173,32 @@
       <w:spacing w:after="0" w:line="240" w:lineRule="auto"/>
     </w:pPr>
     <w:rPr>
-      <w:rFonts w:ascii="Times New Roman" w:hAnsi="Times New Roman" w:eastAsia="Times New Roman" w:cs="Times New Roman"/>
+      <w:rFonts w:ascii="Times New Roman" w:eastAsia="Times New Roman" w:hAnsi="Times New Roman" w:cs="Times New Roman"/>
       <w:sz w:val="28"/>
       <w:szCs w:val="28"/>
     </w:rPr>
   </w:style>
-  <w:style w:type="character" w:styleId="af" w:customStyle="1">
+  <w:style w:type="character" w:customStyle="1" w:styleId="af">
     <w:name w:val="Основной текст с отступом Знак"/>
     <w:basedOn w:val="a0"/>
     <w:link w:val="ae"/>
     <w:semiHidden/>
     <w:rsid w:val="00F22C18"/>
     <w:rPr>
-      <w:rFonts w:ascii="Times New Roman" w:hAnsi="Times New Roman" w:eastAsia="Times New Roman" w:cs="Times New Roman"/>
+      <w:rFonts w:ascii="Times New Roman" w:eastAsia="Times New Roman" w:hAnsi="Times New Roman" w:cs="Times New Roman"/>
       <w:sz w:val="28"/>
       <w:szCs w:val="28"/>
       <w:lang w:eastAsia="ru-RU"/>
     </w:rPr>
   </w:style>
-  <w:style w:type="character" w:styleId="ad" w:customStyle="1">
+  <w:style w:type="character" w:customStyle="1" w:styleId="ad">
     <w:name w:val="Без интервала Знак"/>
     <w:link w:val="ac"/>
     <w:qFormat/>
     <w:locked/>
     <w:rsid w:val="00F004AE"/>
   </w:style>
-  <w:style w:type="paragraph" w:styleId="21" w:customStyle="1">
+  <w:style w:type="paragraph" w:customStyle="1" w:styleId="21">
     <w:name w:val="Без интервала2"/>
     <w:uiPriority w:val="99"/>
     <w:rsid w:val="00F004AE"/>
@@ -4228,7 +4206,7 @@
       <w:spacing w:after="0" w:line="240" w:lineRule="auto"/>
     </w:pPr>
     <w:rPr>
-      <w:rFonts w:ascii="Times New Roman" w:hAnsi="Times New Roman" w:eastAsia="Times New Roman" w:cs="Times New Roman"/>
+      <w:rFonts w:ascii="Times New Roman" w:eastAsia="Times New Roman" w:hAnsi="Times New Roman" w:cs="Times New Roman"/>
     </w:rPr>
   </w:style>
   <w:style w:type="character" w:styleId="af0">
@@ -4243,7 +4221,7 @@
       <w:iCs/>
     </w:rPr>
   </w:style>
-  <w:style w:type="character" w:styleId="30" w:customStyle="1">
+  <w:style w:type="character" w:customStyle="1" w:styleId="30">
     <w:name w:val="Заголовок 3 Знак"/>
     <w:basedOn w:val="a0"/>
     <w:link w:val="3"/>
@@ -4251,33 +4229,33 @@
     <w:qFormat/>
     <w:rsid w:val="00180E3D"/>
     <w:rPr>
-      <w:rFonts w:asciiTheme="majorHAnsi" w:hAnsiTheme="majorHAnsi" w:eastAsiaTheme="majorEastAsia" w:cstheme="majorBidi"/>
+      <w:rFonts w:asciiTheme="majorHAnsi" w:eastAsiaTheme="majorEastAsia" w:hAnsiTheme="majorHAnsi" w:cstheme="majorBidi"/>
       <w:b/>
       <w:bCs/>
       <w:color w:val="4F81BD" w:themeColor="accent1"/>
       <w:lang w:eastAsia="ru-RU"/>
     </w:rPr>
   </w:style>
-  <w:style w:type="character" w:styleId="10" w:customStyle="1">
+  <w:style w:type="character" w:customStyle="1" w:styleId="10">
     <w:name w:val="Заголовок 1 Знак"/>
     <w:basedOn w:val="a0"/>
     <w:link w:val="1"/>
     <w:uiPriority w:val="99"/>
     <w:rsid w:val="00782BC8"/>
     <w:rPr>
-      <w:rFonts w:asciiTheme="majorHAnsi" w:hAnsiTheme="majorHAnsi" w:eastAsiaTheme="majorEastAsia" w:cstheme="majorBidi"/>
+      <w:rFonts w:asciiTheme="majorHAnsi" w:eastAsiaTheme="majorEastAsia" w:hAnsiTheme="majorHAnsi" w:cstheme="majorBidi"/>
       <w:color w:val="365F91" w:themeColor="accent1" w:themeShade="BF"/>
       <w:sz w:val="32"/>
       <w:szCs w:val="32"/>
       <w:lang w:eastAsia="ru-RU"/>
     </w:rPr>
   </w:style>
-  <w:style w:type="character" w:styleId="ListLabel11" w:customStyle="1">
+  <w:style w:type="character" w:customStyle="1" w:styleId="ListLabel11">
     <w:name w:val="ListLabel 11"/>
     <w:qFormat/>
     <w:rsid w:val="00507DA1"/>
   </w:style>
-  <w:style w:type="paragraph" w:styleId="paragraph" w:customStyle="1">
+  <w:style w:type="paragraph" w:customStyle="1" w:styleId="paragraph">
     <w:name w:val="paragraph"/>
     <w:basedOn w:val="a"/>
     <w:rsid w:val="00830DB3"/>
@@ -4285,7 +4263,7 @@
       <w:spacing w:before="100" w:beforeAutospacing="1" w:after="100" w:afterAutospacing="1" w:line="240" w:lineRule="auto"/>
     </w:pPr>
     <w:rPr>
-      <w:rFonts w:ascii="Times New Roman" w:hAnsi="Times New Roman" w:eastAsia="Times New Roman" w:cs="Times New Roman"/>
+      <w:rFonts w:ascii="Times New Roman" w:eastAsia="Times New Roman" w:hAnsi="Times New Roman" w:cs="Times New Roman"/>
       <w:sz w:val="24"/>
       <w:szCs w:val="24"/>
     </w:rPr>
@@ -4300,13 +4278,13 @@
     <w:rsid w:val="00E9468A"/>
     <w:pPr>
       <w:pBdr>
-        <w:bottom w:val="single" w:color="4F81BD" w:sz="8" w:space="4"/>
+        <w:bottom w:val="single" w:sz="8" w:space="4" w:color="4F81BD"/>
       </w:pBdr>
       <w:spacing w:after="300" w:line="240" w:lineRule="auto"/>
       <w:contextualSpacing/>
     </w:pPr>
     <w:rPr>
-      <w:rFonts w:ascii="Times New Roman" w:hAnsi="Times New Roman" w:eastAsia="Times New Roman" w:cs="Times New Roman"/>
+      <w:rFonts w:ascii="Times New Roman" w:eastAsia="Times New Roman" w:hAnsi="Times New Roman" w:cs="Times New Roman"/>
       <w:color w:val="17365D"/>
       <w:spacing w:val="5"/>
       <w:kern w:val="28"/>
@@ -4314,14 +4292,14 @@
       <w:szCs w:val="52"/>
     </w:rPr>
   </w:style>
-  <w:style w:type="character" w:styleId="af2" w:customStyle="1">
+  <w:style w:type="character" w:customStyle="1" w:styleId="af2">
     <w:name w:val="Заголовок Знак"/>
     <w:basedOn w:val="a0"/>
     <w:link w:val="af1"/>
     <w:uiPriority w:val="10"/>
     <w:rsid w:val="00E9468A"/>
     <w:rPr>
-      <w:rFonts w:ascii="Times New Roman" w:hAnsi="Times New Roman" w:eastAsia="Times New Roman" w:cs="Times New Roman"/>
+      <w:rFonts w:ascii="Times New Roman" w:eastAsia="Times New Roman" w:hAnsi="Times New Roman" w:cs="Times New Roman"/>
       <w:color w:val="17365D"/>
       <w:spacing w:val="5"/>
       <w:kern w:val="28"/>
@@ -4330,7 +4308,7 @@
       <w:lang w:eastAsia="ru-RU"/>
     </w:rPr>
   </w:style>
-  <w:style w:type="paragraph" w:styleId="24" w:customStyle="1">
+  <w:style w:type="paragraph" w:customStyle="1" w:styleId="24">
     <w:name w:val="Без интервала24"/>
     <w:qFormat/>
     <w:rsid w:val="00CA42D3"/>
@@ -4338,10 +4316,10 @@
       <w:spacing w:after="0" w:line="240" w:lineRule="auto"/>
     </w:pPr>
     <w:rPr>
-      <w:rFonts w:ascii="Times New Roman" w:hAnsi="Times New Roman" w:eastAsia="Times New Roman" w:cs="Times New Roman"/>
-    </w:rPr>
-  </w:style>
-  <w:style w:type="character" w:styleId="normaltextrun" w:customStyle="1">
+      <w:rFonts w:ascii="Times New Roman" w:eastAsia="Times New Roman" w:hAnsi="Times New Roman" w:cs="Times New Roman"/>
+    </w:rPr>
+  </w:style>
+  <w:style w:type="character" w:customStyle="1" w:styleId="normaltextrun">
     <w:name w:val="normaltextrun"/>
     <w:basedOn w:val="a0"/>
     <w:rsid w:val="00357179"/>
@@ -4357,7 +4335,7 @@
       <w:bCs/>
     </w:rPr>
   </w:style>
-  <w:style w:type="paragraph" w:styleId="Default" w:customStyle="1">
+  <w:style w:type="paragraph" w:customStyle="1" w:styleId="Default">
     <w:name w:val="Default"/>
     <w:rsid w:val="00391AD9"/>
     <w:pPr>
@@ -4367,14 +4345,14 @@
       <w:spacing w:after="0" w:line="240" w:lineRule="auto"/>
     </w:pPr>
     <w:rPr>
-      <w:rFonts w:ascii="Times New Roman" w:hAnsi="Times New Roman" w:cs="Times New Roman" w:eastAsiaTheme="minorEastAsia"/>
+      <w:rFonts w:ascii="Times New Roman" w:eastAsiaTheme="minorEastAsia" w:hAnsi="Times New Roman" w:cs="Times New Roman"/>
       <w:color w:val="000000"/>
       <w:sz w:val="24"/>
       <w:szCs w:val="24"/>
       <w:lang w:eastAsia="ru-RU"/>
     </w:rPr>
   </w:style>
-  <w:style w:type="character" w:styleId="60" w:customStyle="1">
+  <w:style w:type="character" w:customStyle="1" w:styleId="60">
     <w:name w:val="Заголовок 6 Знак"/>
     <w:basedOn w:val="a0"/>
     <w:link w:val="6"/>
@@ -4383,7 +4361,7 @@
     <w:qFormat/>
     <w:rsid w:val="00DD1C4F"/>
     <w:rPr>
-      <w:rFonts w:asciiTheme="majorHAnsi" w:hAnsiTheme="majorHAnsi" w:eastAsiaTheme="majorEastAsia" w:cstheme="majorBidi"/>
+      <w:rFonts w:asciiTheme="majorHAnsi" w:eastAsiaTheme="majorEastAsia" w:hAnsiTheme="majorHAnsi" w:cstheme="majorBidi"/>
       <w:i/>
       <w:iCs/>
       <w:color w:val="244061" w:themeColor="accent1" w:themeShade="80"/>
@@ -4401,34 +4379,34 @@
       <w:jc w:val="both"/>
     </w:pPr>
     <w:rPr>
-      <w:rFonts w:ascii="Times New Roman" w:hAnsi="Times New Roman" w:eastAsia="Times New Roman" w:cs="Times New Roman"/>
+      <w:rFonts w:ascii="Times New Roman" w:eastAsia="Times New Roman" w:hAnsi="Times New Roman" w:cs="Times New Roman"/>
       <w:sz w:val="24"/>
       <w:szCs w:val="20"/>
     </w:rPr>
   </w:style>
-  <w:style w:type="character" w:styleId="af5" w:customStyle="1">
+  <w:style w:type="character" w:customStyle="1" w:styleId="af5">
     <w:name w:val="Основной текст Знак"/>
     <w:basedOn w:val="a0"/>
     <w:link w:val="af4"/>
     <w:rsid w:val="00DD1C4F"/>
     <w:rPr>
-      <w:rFonts w:ascii="Times New Roman" w:hAnsi="Times New Roman" w:eastAsia="Times New Roman" w:cs="Times New Roman"/>
+      <w:rFonts w:ascii="Times New Roman" w:eastAsia="Times New Roman" w:hAnsi="Times New Roman" w:cs="Times New Roman"/>
       <w:sz w:val="24"/>
       <w:szCs w:val="20"/>
       <w:lang w:eastAsia="ru-RU"/>
     </w:rPr>
   </w:style>
-  <w:style w:type="character" w:styleId="gmaildefaultmrcssattr" w:customStyle="1">
+  <w:style w:type="character" w:customStyle="1" w:styleId="gmaildefaultmrcssattr">
     <w:name w:val="gmail_default_mr_css_attr"/>
     <w:basedOn w:val="a0"/>
     <w:rsid w:val="00341EE5"/>
   </w:style>
-  <w:style w:type="character" w:styleId="d64fb4d6842d6ebgmaildefault" w:customStyle="1">
+  <w:style w:type="character" w:customStyle="1" w:styleId="d64fb4d6842d6ebgmaildefault">
     <w:name w:val="d64fb4d6842d6ebgmail_default"/>
     <w:basedOn w:val="a0"/>
     <w:rsid w:val="00656C3F"/>
   </w:style>
-  <w:style w:type="character" w:styleId="layout" w:customStyle="1">
+  <w:style w:type="character" w:customStyle="1" w:styleId="layout">
     <w:name w:val="layout"/>
     <w:basedOn w:val="a0"/>
     <w:rsid w:val="00F16A81"/>
@@ -4443,19 +4421,19 @@
       <w:spacing w:before="100" w:beforeAutospacing="1" w:after="100" w:afterAutospacing="1" w:line="240" w:lineRule="auto"/>
     </w:pPr>
     <w:rPr>
-      <w:rFonts w:ascii="Times New Roman" w:hAnsi="Times New Roman" w:eastAsia="Times New Roman" w:cs="Times New Roman"/>
+      <w:rFonts w:ascii="Times New Roman" w:eastAsia="Times New Roman" w:hAnsi="Times New Roman" w:cs="Times New Roman"/>
       <w:sz w:val="24"/>
       <w:szCs w:val="24"/>
     </w:rPr>
   </w:style>
-  <w:style w:type="character" w:styleId="20" w:customStyle="1">
+  <w:style w:type="character" w:customStyle="1" w:styleId="20">
     <w:name w:val="Заголовок 2 Знак"/>
     <w:basedOn w:val="a0"/>
     <w:link w:val="2"/>
     <w:uiPriority w:val="9"/>
     <w:rsid w:val="002C343B"/>
     <w:rPr>
-      <w:rFonts w:asciiTheme="majorHAnsi" w:hAnsiTheme="majorHAnsi" w:eastAsiaTheme="majorEastAsia" w:cstheme="majorBidi"/>
+      <w:rFonts w:asciiTheme="majorHAnsi" w:eastAsiaTheme="majorEastAsia" w:hAnsiTheme="majorHAnsi" w:cstheme="majorBidi"/>
       <w:b/>
       <w:bCs/>
       <w:color w:val="4F81BD" w:themeColor="accent1"/>
@@ -4464,7 +4442,7 @@
       <w:lang w:eastAsia="ru-RU"/>
     </w:rPr>
   </w:style>
-  <w:style w:type="character" w:styleId="40" w:customStyle="1">
+  <w:style w:type="character" w:customStyle="1" w:styleId="40">
     <w:name w:val="Заголовок 4 Знак"/>
     <w:basedOn w:val="a0"/>
     <w:link w:val="4"/>
@@ -4472,7 +4450,7 @@
     <w:semiHidden/>
     <w:rsid w:val="002C343B"/>
     <w:rPr>
-      <w:rFonts w:asciiTheme="majorHAnsi" w:hAnsiTheme="majorHAnsi" w:eastAsiaTheme="majorEastAsia" w:cstheme="majorBidi"/>
+      <w:rFonts w:asciiTheme="majorHAnsi" w:eastAsiaTheme="majorEastAsia" w:hAnsiTheme="majorHAnsi" w:cstheme="majorBidi"/>
       <w:b/>
       <w:bCs/>
       <w:i/>
@@ -4481,7 +4459,7 @@
       <w:lang w:eastAsia="ru-RU"/>
     </w:rPr>
   </w:style>
-  <w:style w:type="character" w:styleId="50" w:customStyle="1">
+  <w:style w:type="character" w:customStyle="1" w:styleId="50">
     <w:name w:val="Заголовок 5 Знак"/>
     <w:basedOn w:val="a0"/>
     <w:link w:val="5"/>
@@ -4490,12 +4468,12 @@
     <w:qFormat/>
     <w:rsid w:val="002C343B"/>
     <w:rPr>
-      <w:rFonts w:asciiTheme="majorHAnsi" w:hAnsiTheme="majorHAnsi" w:eastAsiaTheme="majorEastAsia" w:cstheme="majorBidi"/>
+      <w:rFonts w:asciiTheme="majorHAnsi" w:eastAsiaTheme="majorEastAsia" w:hAnsiTheme="majorHAnsi" w:cstheme="majorBidi"/>
       <w:color w:val="244061" w:themeColor="accent1" w:themeShade="80"/>
       <w:lang w:eastAsia="ru-RU"/>
     </w:rPr>
   </w:style>
-  <w:style w:type="character" w:styleId="70" w:customStyle="1">
+  <w:style w:type="character" w:customStyle="1" w:styleId="70">
     <w:name w:val="Заголовок 7 Знак"/>
     <w:basedOn w:val="a0"/>
     <w:link w:val="7"/>
@@ -4503,14 +4481,14 @@
     <w:semiHidden/>
     <w:rsid w:val="002C343B"/>
     <w:rPr>
-      <w:rFonts w:asciiTheme="majorHAnsi" w:hAnsiTheme="majorHAnsi" w:eastAsiaTheme="majorEastAsia" w:cstheme="majorBidi"/>
+      <w:rFonts w:asciiTheme="majorHAnsi" w:eastAsiaTheme="majorEastAsia" w:hAnsiTheme="majorHAnsi" w:cstheme="majorBidi"/>
       <w:i/>
       <w:iCs/>
       <w:color w:val="404040" w:themeColor="text1" w:themeTint="BF"/>
       <w:lang w:eastAsia="ru-RU"/>
     </w:rPr>
   </w:style>
-  <w:style w:type="character" w:styleId="80" w:customStyle="1">
+  <w:style w:type="character" w:customStyle="1" w:styleId="80">
     <w:name w:val="Заголовок 8 Знак"/>
     <w:basedOn w:val="a0"/>
     <w:link w:val="8"/>
@@ -4518,14 +4496,14 @@
     <w:semiHidden/>
     <w:rsid w:val="002C343B"/>
     <w:rPr>
-      <w:rFonts w:asciiTheme="majorHAnsi" w:hAnsiTheme="majorHAnsi" w:eastAsiaTheme="majorEastAsia" w:cstheme="majorBidi"/>
+      <w:rFonts w:asciiTheme="majorHAnsi" w:eastAsiaTheme="majorEastAsia" w:hAnsiTheme="majorHAnsi" w:cstheme="majorBidi"/>
       <w:color w:val="4F81BD" w:themeColor="accent1"/>
       <w:sz w:val="20"/>
       <w:szCs w:val="20"/>
       <w:lang w:eastAsia="ru-RU"/>
     </w:rPr>
   </w:style>
-  <w:style w:type="character" w:styleId="90" w:customStyle="1">
+  <w:style w:type="character" w:customStyle="1" w:styleId="90">
     <w:name w:val="Заголовок 9 Знак"/>
     <w:basedOn w:val="a0"/>
     <w:link w:val="9"/>
@@ -4533,7 +4511,7 @@
     <w:semiHidden/>
     <w:rsid w:val="002C343B"/>
     <w:rPr>
-      <w:rFonts w:asciiTheme="majorHAnsi" w:hAnsiTheme="majorHAnsi" w:eastAsiaTheme="majorEastAsia" w:cstheme="majorBidi"/>
+      <w:rFonts w:asciiTheme="majorHAnsi" w:eastAsiaTheme="majorEastAsia" w:hAnsiTheme="majorHAnsi" w:cstheme="majorBidi"/>
       <w:i/>
       <w:iCs/>
       <w:color w:val="404040" w:themeColor="text1" w:themeTint="BF"/>
@@ -4590,19 +4568,19 @@
       <w:spacing w:after="0" w:line="240" w:lineRule="auto"/>
     </w:pPr>
     <w:rPr>
-      <w:rFonts w:ascii="Courier New" w:hAnsi="Courier New" w:eastAsia="Courier New" w:cs="Times New Roman"/>
+      <w:rFonts w:ascii="Courier New" w:eastAsia="Courier New" w:hAnsi="Courier New" w:cs="Times New Roman"/>
       <w:sz w:val="20"/>
       <w:szCs w:val="20"/>
     </w:rPr>
   </w:style>
-  <w:style w:type="character" w:styleId="HTML0" w:customStyle="1">
+  <w:style w:type="character" w:customStyle="1" w:styleId="HTML0">
     <w:name w:val="Стандартный HTML Знак"/>
     <w:aliases w:val="Знак Знак"/>
     <w:basedOn w:val="a0"/>
     <w:link w:val="HTML"/>
     <w:rsid w:val="002C343B"/>
     <w:rPr>
-      <w:rFonts w:ascii="Courier New" w:hAnsi="Courier New" w:eastAsia="Courier New" w:cs="Times New Roman"/>
+      <w:rFonts w:ascii="Courier New" w:eastAsia="Courier New" w:hAnsi="Courier New" w:cs="Times New Roman"/>
       <w:sz w:val="20"/>
       <w:szCs w:val="20"/>
       <w:lang w:eastAsia="ru-RU"/>
@@ -4619,20 +4597,20 @@
       <w:jc w:val="center"/>
     </w:pPr>
     <w:rPr>
-      <w:rFonts w:ascii="Courier New" w:hAnsi="Courier New" w:eastAsia="Times New Roman" w:cs="Times New Roman"/>
+      <w:rFonts w:ascii="Courier New" w:eastAsia="Times New Roman" w:hAnsi="Courier New" w:cs="Times New Roman"/>
       <w:sz w:val="20"/>
       <w:szCs w:val="20"/>
       <w:lang w:val="en-US" w:eastAsia="en-US"/>
     </w:rPr>
   </w:style>
-  <w:style w:type="character" w:styleId="af9" w:customStyle="1">
+  <w:style w:type="character" w:customStyle="1" w:styleId="af9">
     <w:name w:val="Текст Знак"/>
     <w:basedOn w:val="a0"/>
     <w:link w:val="af8"/>
     <w:semiHidden/>
     <w:rsid w:val="002C343B"/>
     <w:rPr>
-      <w:rFonts w:ascii="Courier New" w:hAnsi="Courier New" w:eastAsia="Times New Roman" w:cs="Times New Roman"/>
+      <w:rFonts w:ascii="Courier New" w:eastAsia="Times New Roman" w:hAnsi="Courier New" w:cs="Times New Roman"/>
       <w:sz w:val="20"/>
       <w:szCs w:val="20"/>
       <w:lang w:val="en-US"/>
@@ -4647,7 +4625,7 @@
     <w:qFormat/>
     <w:rsid w:val="002C343B"/>
     <w:rPr>
-      <w:rFonts w:asciiTheme="majorHAnsi" w:hAnsiTheme="majorHAnsi" w:eastAsiaTheme="majorEastAsia" w:cstheme="majorBidi"/>
+      <w:rFonts w:asciiTheme="majorHAnsi" w:eastAsiaTheme="majorEastAsia" w:hAnsiTheme="majorHAnsi" w:cstheme="majorBidi"/>
       <w:i/>
       <w:iCs/>
       <w:color w:val="4F81BD" w:themeColor="accent1"/>
@@ -4656,14 +4634,14 @@
       <w:szCs w:val="24"/>
     </w:rPr>
   </w:style>
-  <w:style w:type="character" w:styleId="afb" w:customStyle="1">
+  <w:style w:type="character" w:customStyle="1" w:styleId="afb">
     <w:name w:val="Подзаголовок Знак"/>
     <w:basedOn w:val="a0"/>
     <w:link w:val="afa"/>
     <w:uiPriority w:val="99"/>
     <w:rsid w:val="002C343B"/>
     <w:rPr>
-      <w:rFonts w:asciiTheme="majorHAnsi" w:hAnsiTheme="majorHAnsi" w:eastAsiaTheme="majorEastAsia" w:cstheme="majorBidi"/>
+      <w:rFonts w:asciiTheme="majorHAnsi" w:eastAsiaTheme="majorEastAsia" w:hAnsiTheme="majorHAnsi" w:cstheme="majorBidi"/>
       <w:i/>
       <w:iCs/>
       <w:color w:val="4F81BD" w:themeColor="accent1"/>
@@ -4687,7 +4665,7 @@
       <w:color w:val="000000" w:themeColor="text1"/>
     </w:rPr>
   </w:style>
-  <w:style w:type="character" w:styleId="23" w:customStyle="1">
+  <w:style w:type="character" w:customStyle="1" w:styleId="23">
     <w:name w:val="Цитата 2 Знак"/>
     <w:basedOn w:val="a0"/>
     <w:link w:val="22"/>
@@ -4711,7 +4689,7 @@
     <w:rsid w:val="002C343B"/>
     <w:pPr>
       <w:pBdr>
-        <w:bottom w:val="single" w:color="4F81BD" w:themeColor="accent1" w:sz="4" w:space="4"/>
+        <w:bottom w:val="single" w:sz="4" w:space="4" w:color="4F81BD" w:themeColor="accent1"/>
       </w:pBdr>
       <w:spacing w:before="200" w:after="280"/>
       <w:ind w:left="936" w:right="936"/>
@@ -4724,7 +4702,7 @@
       <w:color w:val="4F81BD" w:themeColor="accent1"/>
     </w:rPr>
   </w:style>
-  <w:style w:type="character" w:styleId="afd" w:customStyle="1">
+  <w:style w:type="character" w:customStyle="1" w:styleId="afd">
     <w:name w:val="Выделенная цитата Знак"/>
     <w:basedOn w:val="a0"/>
     <w:link w:val="afc"/>
@@ -4740,7 +4718,7 @@
       <w:lang w:eastAsia="ru-RU"/>
     </w:rPr>
   </w:style>
-  <w:style w:type="character" w:styleId="11" w:customStyle="1">
+  <w:style w:type="character" w:customStyle="1" w:styleId="11">
     <w:name w:val="Слабое выделение1"/>
     <w:basedOn w:val="a0"/>
     <w:uiPriority w:val="19"/>
@@ -4752,7 +4730,7 @@
       <w:color w:val="7F7F7F" w:themeColor="text1" w:themeTint="80"/>
     </w:rPr>
   </w:style>
-  <w:style w:type="character" w:styleId="12" w:customStyle="1">
+  <w:style w:type="character" w:customStyle="1" w:styleId="12">
     <w:name w:val="Сильное выделение1"/>
     <w:basedOn w:val="a0"/>
     <w:uiPriority w:val="21"/>
@@ -4766,7 +4744,7 @@
       <w:color w:val="4F81BD" w:themeColor="accent1"/>
     </w:rPr>
   </w:style>
-  <w:style w:type="character" w:styleId="13" w:customStyle="1">
+  <w:style w:type="character" w:customStyle="1" w:styleId="13">
     <w:name w:val="Слабая ссылка1"/>
     <w:basedOn w:val="a0"/>
     <w:uiPriority w:val="31"/>
@@ -4778,7 +4756,7 @@
       <w:u w:val="single"/>
     </w:rPr>
   </w:style>
-  <w:style w:type="character" w:styleId="14" w:customStyle="1">
+  <w:style w:type="character" w:customStyle="1" w:styleId="14">
     <w:name w:val="Сильная ссылка1"/>
     <w:basedOn w:val="a0"/>
     <w:uiPriority w:val="32"/>
@@ -4793,7 +4771,7 @@
       <w:u w:val="single"/>
     </w:rPr>
   </w:style>
-  <w:style w:type="character" w:styleId="15" w:customStyle="1">
+  <w:style w:type="character" w:customStyle="1" w:styleId="15">
     <w:name w:val="Название книги1"/>
     <w:basedOn w:val="a0"/>
     <w:uiPriority w:val="33"/>
@@ -4806,7 +4784,7 @@
       <w:spacing w:val="5"/>
     </w:rPr>
   </w:style>
-  <w:style w:type="paragraph" w:styleId="16" w:customStyle="1">
+  <w:style w:type="paragraph" w:customStyle="1" w:styleId="16">
     <w:name w:val="Заголовок оглавления1"/>
     <w:basedOn w:val="1"/>
     <w:next w:val="a"/>
@@ -4826,32 +4804,32 @@
       <w:szCs w:val="28"/>
     </w:rPr>
   </w:style>
-  <w:style w:type="paragraph" w:styleId="100" w:customStyle="1">
+  <w:style w:type="paragraph" w:customStyle="1" w:styleId="100">
     <w:name w:val="Обычный + 10 пт"/>
     <w:basedOn w:val="ac"/>
     <w:uiPriority w:val="99"/>
     <w:rsid w:val="002C343B"/>
     <w:rPr>
-      <w:rFonts w:ascii="Times New Roman" w:hAnsi="Times New Roman" w:eastAsia="Times New Roman" w:cs="Times New Roman"/>
+      <w:rFonts w:ascii="Times New Roman" w:eastAsia="Times New Roman" w:hAnsi="Times New Roman" w:cs="Times New Roman"/>
       <w:b/>
       <w:sz w:val="24"/>
       <w:szCs w:val="24"/>
     </w:rPr>
   </w:style>
-  <w:style w:type="paragraph" w:styleId="NoSpacing10" w:customStyle="1">
+  <w:style w:type="paragraph" w:customStyle="1" w:styleId="NoSpacing10">
     <w:name w:val="No Spacing + 10 пт"/>
     <w:basedOn w:val="ac"/>
     <w:link w:val="NoSpacing100"/>
     <w:uiPriority w:val="99"/>
     <w:rsid w:val="002C343B"/>
     <w:rPr>
-      <w:rFonts w:ascii="Times New Roman" w:hAnsi="Times New Roman" w:eastAsia="Times New Roman" w:cs="Times New Roman"/>
+      <w:rFonts w:ascii="Times New Roman" w:eastAsia="Times New Roman" w:hAnsi="Times New Roman" w:cs="Times New Roman"/>
       <w:b/>
       <w:sz w:val="24"/>
       <w:szCs w:val="24"/>
     </w:rPr>
   </w:style>
-  <w:style w:type="paragraph" w:styleId="17" w:customStyle="1">
+  <w:style w:type="paragraph" w:customStyle="1" w:styleId="17">
     <w:name w:val="Без интервала1"/>
     <w:link w:val="NoSpacingChar"/>
     <w:rsid w:val="002C343B"/>
@@ -4859,199 +4837,199 @@
       <w:spacing w:after="0" w:line="240" w:lineRule="auto"/>
     </w:pPr>
     <w:rPr>
-      <w:rFonts w:ascii="Times New Roman" w:hAnsi="Times New Roman" w:eastAsia="Times New Roman" w:cs="Times New Roman"/>
-    </w:rPr>
-  </w:style>
-  <w:style w:type="character" w:styleId="NoSpacingChar" w:customStyle="1">
+      <w:rFonts w:ascii="Times New Roman" w:eastAsia="Times New Roman" w:hAnsi="Times New Roman" w:cs="Times New Roman"/>
+    </w:rPr>
+  </w:style>
+  <w:style w:type="character" w:customStyle="1" w:styleId="NoSpacingChar">
     <w:name w:val="No Spacing Char"/>
     <w:link w:val="17"/>
     <w:locked/>
     <w:rsid w:val="002C343B"/>
     <w:rPr>
-      <w:rFonts w:ascii="Times New Roman" w:hAnsi="Times New Roman" w:eastAsia="Times New Roman" w:cs="Times New Roman"/>
-    </w:rPr>
-  </w:style>
-  <w:style w:type="paragraph" w:styleId="31" w:customStyle="1">
+      <w:rFonts w:ascii="Times New Roman" w:eastAsia="Times New Roman" w:hAnsi="Times New Roman" w:cs="Times New Roman"/>
+    </w:rPr>
+  </w:style>
+  <w:style w:type="paragraph" w:customStyle="1" w:styleId="31">
     <w:name w:val="Без интервала3"/>
     <w:rsid w:val="002C343B"/>
     <w:pPr>
       <w:spacing w:after="0" w:line="240" w:lineRule="auto"/>
     </w:pPr>
     <w:rPr>
-      <w:rFonts w:ascii="Times New Roman" w:hAnsi="Times New Roman" w:eastAsia="Times New Roman" w:cs="Times New Roman"/>
+      <w:rFonts w:ascii="Times New Roman" w:eastAsia="Times New Roman" w:hAnsi="Times New Roman" w:cs="Times New Roman"/>
       <w:szCs w:val="20"/>
     </w:rPr>
   </w:style>
-  <w:style w:type="paragraph" w:styleId="41" w:customStyle="1">
+  <w:style w:type="paragraph" w:customStyle="1" w:styleId="41">
     <w:name w:val="Без интервала4"/>
     <w:rsid w:val="002C343B"/>
     <w:pPr>
       <w:spacing w:after="0" w:line="240" w:lineRule="auto"/>
     </w:pPr>
     <w:rPr>
-      <w:rFonts w:ascii="Times New Roman" w:hAnsi="Times New Roman" w:eastAsia="Times New Roman" w:cs="Times New Roman"/>
-    </w:rPr>
-  </w:style>
-  <w:style w:type="paragraph" w:styleId="51" w:customStyle="1">
+      <w:rFonts w:ascii="Times New Roman" w:eastAsia="Times New Roman" w:hAnsi="Times New Roman" w:cs="Times New Roman"/>
+    </w:rPr>
+  </w:style>
+  <w:style w:type="paragraph" w:customStyle="1" w:styleId="51">
     <w:name w:val="Без интервала5"/>
     <w:rsid w:val="002C343B"/>
     <w:pPr>
       <w:spacing w:after="0" w:line="240" w:lineRule="auto"/>
     </w:pPr>
     <w:rPr>
-      <w:rFonts w:ascii="Times New Roman" w:hAnsi="Times New Roman" w:eastAsia="Times New Roman" w:cs="Times New Roman"/>
+      <w:rFonts w:ascii="Times New Roman" w:eastAsia="Times New Roman" w:hAnsi="Times New Roman" w:cs="Times New Roman"/>
       <w:szCs w:val="20"/>
     </w:rPr>
   </w:style>
-  <w:style w:type="paragraph" w:styleId="61" w:customStyle="1">
+  <w:style w:type="paragraph" w:customStyle="1" w:styleId="61">
     <w:name w:val="Без интервала6"/>
     <w:rsid w:val="002C343B"/>
     <w:pPr>
       <w:spacing w:after="0" w:line="240" w:lineRule="auto"/>
     </w:pPr>
     <w:rPr>
-      <w:rFonts w:ascii="Times New Roman" w:hAnsi="Times New Roman" w:eastAsia="Times New Roman" w:cs="Times New Roman"/>
-    </w:rPr>
-  </w:style>
-  <w:style w:type="character" w:styleId="NoSpacing100" w:customStyle="1">
+      <w:rFonts w:ascii="Times New Roman" w:eastAsia="Times New Roman" w:hAnsi="Times New Roman" w:cs="Times New Roman"/>
+    </w:rPr>
+  </w:style>
+  <w:style w:type="character" w:customStyle="1" w:styleId="NoSpacing100">
     <w:name w:val="No Spacing + 10 пт Знак"/>
     <w:basedOn w:val="NoSpacingChar"/>
     <w:link w:val="NoSpacing10"/>
     <w:uiPriority w:val="99"/>
     <w:rsid w:val="002C343B"/>
     <w:rPr>
-      <w:rFonts w:ascii="Times New Roman" w:hAnsi="Times New Roman" w:eastAsia="Times New Roman" w:cs="Times New Roman"/>
+      <w:rFonts w:ascii="Times New Roman" w:eastAsia="Times New Roman" w:hAnsi="Times New Roman" w:cs="Times New Roman"/>
       <w:b/>
       <w:sz w:val="24"/>
       <w:szCs w:val="24"/>
     </w:rPr>
   </w:style>
-  <w:style w:type="paragraph" w:styleId="71" w:customStyle="1">
+  <w:style w:type="paragraph" w:customStyle="1" w:styleId="71">
     <w:name w:val="Без интервала7"/>
     <w:rsid w:val="002C343B"/>
     <w:pPr>
       <w:spacing w:after="0" w:line="240" w:lineRule="auto"/>
     </w:pPr>
     <w:rPr>
-      <w:rFonts w:ascii="Times New Roman" w:hAnsi="Times New Roman" w:eastAsia="Times New Roman" w:cs="Times New Roman"/>
-    </w:rPr>
-  </w:style>
-  <w:style w:type="paragraph" w:styleId="81" w:customStyle="1">
+      <w:rFonts w:ascii="Times New Roman" w:eastAsia="Times New Roman" w:hAnsi="Times New Roman" w:cs="Times New Roman"/>
+    </w:rPr>
+  </w:style>
+  <w:style w:type="paragraph" w:customStyle="1" w:styleId="81">
     <w:name w:val="Без интервала8"/>
     <w:rsid w:val="002C343B"/>
     <w:pPr>
       <w:spacing w:after="0" w:line="240" w:lineRule="auto"/>
     </w:pPr>
     <w:rPr>
-      <w:rFonts w:ascii="Times New Roman" w:hAnsi="Times New Roman" w:eastAsia="Times New Roman" w:cs="Times New Roman"/>
+      <w:rFonts w:ascii="Times New Roman" w:eastAsia="Times New Roman" w:hAnsi="Times New Roman" w:cs="Times New Roman"/>
       <w:szCs w:val="20"/>
     </w:rPr>
   </w:style>
-  <w:style w:type="paragraph" w:styleId="91" w:customStyle="1">
+  <w:style w:type="paragraph" w:customStyle="1" w:styleId="91">
     <w:name w:val="Без интервала9"/>
     <w:rsid w:val="002C343B"/>
     <w:pPr>
       <w:spacing w:after="0" w:line="240" w:lineRule="auto"/>
     </w:pPr>
     <w:rPr>
-      <w:rFonts w:ascii="Times New Roman" w:hAnsi="Times New Roman" w:eastAsia="Times New Roman" w:cs="Times New Roman"/>
-    </w:rPr>
-  </w:style>
-  <w:style w:type="paragraph" w:styleId="101" w:customStyle="1">
+      <w:rFonts w:ascii="Times New Roman" w:eastAsia="Times New Roman" w:hAnsi="Times New Roman" w:cs="Times New Roman"/>
+    </w:rPr>
+  </w:style>
+  <w:style w:type="paragraph" w:customStyle="1" w:styleId="101">
     <w:name w:val="Без интервала10"/>
     <w:rsid w:val="002C343B"/>
     <w:pPr>
       <w:spacing w:after="0" w:line="240" w:lineRule="auto"/>
     </w:pPr>
     <w:rPr>
-      <w:rFonts w:ascii="Times New Roman" w:hAnsi="Times New Roman" w:eastAsia="Times New Roman" w:cs="Times New Roman"/>
+      <w:rFonts w:ascii="Times New Roman" w:eastAsia="Times New Roman" w:hAnsi="Times New Roman" w:cs="Times New Roman"/>
       <w:szCs w:val="20"/>
     </w:rPr>
   </w:style>
-  <w:style w:type="paragraph" w:styleId="110" w:customStyle="1">
+  <w:style w:type="paragraph" w:customStyle="1" w:styleId="110">
     <w:name w:val="Без интервала11"/>
     <w:rsid w:val="002C343B"/>
     <w:pPr>
       <w:spacing w:after="0" w:line="240" w:lineRule="auto"/>
     </w:pPr>
     <w:rPr>
-      <w:rFonts w:ascii="Times New Roman" w:hAnsi="Times New Roman" w:eastAsia="Times New Roman" w:cs="Times New Roman"/>
-    </w:rPr>
-  </w:style>
-  <w:style w:type="character" w:styleId="NoSpacing101" w:customStyle="1">
+      <w:rFonts w:ascii="Times New Roman" w:eastAsia="Times New Roman" w:hAnsi="Times New Roman" w:cs="Times New Roman"/>
+    </w:rPr>
+  </w:style>
+  <w:style w:type="character" w:customStyle="1" w:styleId="NoSpacing101">
     <w:name w:val="No Spacing + 10 пт;По центру Знак Знак"/>
     <w:basedOn w:val="NoSpacingChar"/>
     <w:rsid w:val="002C343B"/>
     <w:rPr>
-      <w:rFonts w:ascii="Times New Roman" w:hAnsi="Times New Roman" w:eastAsia="Times New Roman" w:cs="Times New Roman"/>
+      <w:rFonts w:ascii="Times New Roman" w:eastAsia="Times New Roman" w:hAnsi="Times New Roman" w:cs="Times New Roman"/>
       <w:b/>
       <w:sz w:val="24"/>
       <w:szCs w:val="24"/>
       <w:lang w:val="ru-RU" w:bidi="ar-SA"/>
     </w:rPr>
   </w:style>
-  <w:style w:type="paragraph" w:styleId="120" w:customStyle="1">
+  <w:style w:type="paragraph" w:customStyle="1" w:styleId="120">
     <w:name w:val="Без интервала12"/>
     <w:rsid w:val="002C343B"/>
     <w:pPr>
       <w:spacing w:after="0" w:line="240" w:lineRule="auto"/>
     </w:pPr>
     <w:rPr>
-      <w:rFonts w:ascii="Times New Roman" w:hAnsi="Times New Roman" w:eastAsia="Times New Roman" w:cs="Times New Roman"/>
+      <w:rFonts w:ascii="Times New Roman" w:eastAsia="Times New Roman" w:hAnsi="Times New Roman" w:cs="Times New Roman"/>
       <w:szCs w:val="20"/>
     </w:rPr>
   </w:style>
-  <w:style w:type="paragraph" w:styleId="130" w:customStyle="1">
+  <w:style w:type="paragraph" w:customStyle="1" w:styleId="130">
     <w:name w:val="Без интервала13"/>
     <w:rsid w:val="002C343B"/>
     <w:pPr>
       <w:spacing w:after="0" w:line="240" w:lineRule="auto"/>
     </w:pPr>
     <w:rPr>
-      <w:rFonts w:ascii="Times New Roman" w:hAnsi="Times New Roman" w:eastAsia="Times New Roman" w:cs="Times New Roman"/>
-    </w:rPr>
-  </w:style>
-  <w:style w:type="paragraph" w:styleId="140" w:customStyle="1">
+      <w:rFonts w:ascii="Times New Roman" w:eastAsia="Times New Roman" w:hAnsi="Times New Roman" w:cs="Times New Roman"/>
+    </w:rPr>
+  </w:style>
+  <w:style w:type="paragraph" w:customStyle="1" w:styleId="140">
     <w:name w:val="Без интервала14"/>
     <w:rsid w:val="002C343B"/>
     <w:pPr>
       <w:spacing w:after="0" w:line="240" w:lineRule="auto"/>
     </w:pPr>
     <w:rPr>
-      <w:rFonts w:ascii="Times New Roman" w:hAnsi="Times New Roman" w:eastAsia="Times New Roman" w:cs="Times New Roman"/>
-    </w:rPr>
-  </w:style>
-  <w:style w:type="paragraph" w:styleId="150" w:customStyle="1">
+      <w:rFonts w:ascii="Times New Roman" w:eastAsia="Times New Roman" w:hAnsi="Times New Roman" w:cs="Times New Roman"/>
+    </w:rPr>
+  </w:style>
+  <w:style w:type="paragraph" w:customStyle="1" w:styleId="150">
     <w:name w:val="Без интервала15"/>
     <w:rsid w:val="002C343B"/>
     <w:pPr>
       <w:spacing w:after="0" w:line="240" w:lineRule="auto"/>
     </w:pPr>
     <w:rPr>
-      <w:rFonts w:ascii="Times New Roman" w:hAnsi="Times New Roman" w:eastAsia="Times New Roman" w:cs="Times New Roman"/>
-    </w:rPr>
-  </w:style>
-  <w:style w:type="paragraph" w:styleId="160" w:customStyle="1">
+      <w:rFonts w:ascii="Times New Roman" w:eastAsia="Times New Roman" w:hAnsi="Times New Roman" w:cs="Times New Roman"/>
+    </w:rPr>
+  </w:style>
+  <w:style w:type="paragraph" w:customStyle="1" w:styleId="160">
     <w:name w:val="Без интервала16"/>
     <w:rsid w:val="002C343B"/>
     <w:pPr>
       <w:spacing w:after="0" w:line="240" w:lineRule="auto"/>
     </w:pPr>
     <w:rPr>
-      <w:rFonts w:ascii="Times New Roman" w:hAnsi="Times New Roman" w:eastAsia="Times New Roman" w:cs="Times New Roman"/>
-    </w:rPr>
-  </w:style>
-  <w:style w:type="paragraph" w:styleId="170" w:customStyle="1">
+      <w:rFonts w:ascii="Times New Roman" w:eastAsia="Times New Roman" w:hAnsi="Times New Roman" w:cs="Times New Roman"/>
+    </w:rPr>
+  </w:style>
+  <w:style w:type="paragraph" w:customStyle="1" w:styleId="170">
     <w:name w:val="Без интервала17"/>
     <w:rsid w:val="002C343B"/>
     <w:pPr>
       <w:spacing w:after="0" w:line="240" w:lineRule="auto"/>
     </w:pPr>
     <w:rPr>
-      <w:rFonts w:ascii="Times New Roman" w:hAnsi="Times New Roman" w:eastAsia="Times New Roman" w:cs="Times New Roman"/>
-    </w:rPr>
-  </w:style>
-  <w:style w:type="character" w:styleId="800" w:customStyle="1">
+      <w:rFonts w:ascii="Times New Roman" w:eastAsia="Times New Roman" w:hAnsi="Times New Roman" w:cs="Times New Roman"/>
+    </w:rPr>
+  </w:style>
+  <w:style w:type="character" w:customStyle="1" w:styleId="800">
     <w:name w:val="Обычный + 8 пт;полужирный;По центру;После:  0 пт Знак Знак"/>
     <w:rsid w:val="002C343B"/>
     <w:rPr>
@@ -5061,172 +5039,172 @@
       <w:lang w:val="ru-RU" w:eastAsia="en-US" w:bidi="ar-SA"/>
     </w:rPr>
   </w:style>
-  <w:style w:type="paragraph" w:styleId="18" w:customStyle="1">
+  <w:style w:type="paragraph" w:customStyle="1" w:styleId="18">
     <w:name w:val="Без интервала18"/>
     <w:rsid w:val="002C343B"/>
     <w:pPr>
       <w:spacing w:after="0" w:line="240" w:lineRule="auto"/>
     </w:pPr>
     <w:rPr>
-      <w:rFonts w:ascii="Times New Roman" w:hAnsi="Times New Roman" w:eastAsia="Times New Roman" w:cs="Times New Roman"/>
-    </w:rPr>
-  </w:style>
-  <w:style w:type="paragraph" w:styleId="19" w:customStyle="1">
+      <w:rFonts w:ascii="Times New Roman" w:eastAsia="Times New Roman" w:hAnsi="Times New Roman" w:cs="Times New Roman"/>
+    </w:rPr>
+  </w:style>
+  <w:style w:type="paragraph" w:customStyle="1" w:styleId="19">
     <w:name w:val="Без интервала19"/>
     <w:rsid w:val="002C343B"/>
     <w:pPr>
       <w:spacing w:after="0" w:line="240" w:lineRule="auto"/>
     </w:pPr>
     <w:rPr>
-      <w:rFonts w:ascii="Times New Roman" w:hAnsi="Times New Roman" w:eastAsia="Times New Roman" w:cs="Times New Roman"/>
-    </w:rPr>
-  </w:style>
-  <w:style w:type="paragraph" w:styleId="200" w:customStyle="1">
+      <w:rFonts w:ascii="Times New Roman" w:eastAsia="Times New Roman" w:hAnsi="Times New Roman" w:cs="Times New Roman"/>
+    </w:rPr>
+  </w:style>
+  <w:style w:type="paragraph" w:customStyle="1" w:styleId="200">
     <w:name w:val="Без интервала20"/>
     <w:rsid w:val="002C343B"/>
     <w:pPr>
       <w:spacing w:after="0" w:line="240" w:lineRule="auto"/>
     </w:pPr>
     <w:rPr>
-      <w:rFonts w:ascii="Times New Roman" w:hAnsi="Times New Roman" w:eastAsia="Times New Roman" w:cs="Times New Roman"/>
-    </w:rPr>
-  </w:style>
-  <w:style w:type="paragraph" w:styleId="210" w:customStyle="1">
+      <w:rFonts w:ascii="Times New Roman" w:eastAsia="Times New Roman" w:hAnsi="Times New Roman" w:cs="Times New Roman"/>
+    </w:rPr>
+  </w:style>
+  <w:style w:type="paragraph" w:customStyle="1" w:styleId="210">
     <w:name w:val="Без интервала21"/>
     <w:rsid w:val="002C343B"/>
     <w:pPr>
       <w:spacing w:after="0" w:line="240" w:lineRule="auto"/>
     </w:pPr>
     <w:rPr>
-      <w:rFonts w:ascii="Times New Roman" w:hAnsi="Times New Roman" w:eastAsia="Times New Roman" w:cs="Times New Roman"/>
-    </w:rPr>
-  </w:style>
-  <w:style w:type="paragraph" w:styleId="220" w:customStyle="1">
+      <w:rFonts w:ascii="Times New Roman" w:eastAsia="Times New Roman" w:hAnsi="Times New Roman" w:cs="Times New Roman"/>
+    </w:rPr>
+  </w:style>
+  <w:style w:type="paragraph" w:customStyle="1" w:styleId="220">
     <w:name w:val="Без интервала22"/>
     <w:rsid w:val="002C343B"/>
     <w:pPr>
       <w:spacing w:after="0" w:line="240" w:lineRule="auto"/>
     </w:pPr>
     <w:rPr>
-      <w:rFonts w:ascii="Times New Roman" w:hAnsi="Times New Roman" w:eastAsia="Times New Roman" w:cs="Times New Roman"/>
-    </w:rPr>
-  </w:style>
-  <w:style w:type="paragraph" w:styleId="230" w:customStyle="1">
+      <w:rFonts w:ascii="Times New Roman" w:eastAsia="Times New Roman" w:hAnsi="Times New Roman" w:cs="Times New Roman"/>
+    </w:rPr>
+  </w:style>
+  <w:style w:type="paragraph" w:customStyle="1" w:styleId="230">
     <w:name w:val="Без интервала23"/>
     <w:rsid w:val="002C343B"/>
     <w:pPr>
       <w:spacing w:after="0" w:line="240" w:lineRule="auto"/>
     </w:pPr>
     <w:rPr>
-      <w:rFonts w:ascii="Times New Roman" w:hAnsi="Times New Roman" w:eastAsia="Times New Roman" w:cs="Times New Roman"/>
-    </w:rPr>
-  </w:style>
-  <w:style w:type="paragraph" w:styleId="25" w:customStyle="1">
+      <w:rFonts w:ascii="Times New Roman" w:eastAsia="Times New Roman" w:hAnsi="Times New Roman" w:cs="Times New Roman"/>
+    </w:rPr>
+  </w:style>
+  <w:style w:type="paragraph" w:customStyle="1" w:styleId="25">
     <w:name w:val="Без интервала25"/>
     <w:rsid w:val="002C343B"/>
     <w:pPr>
       <w:spacing w:after="0" w:line="240" w:lineRule="auto"/>
     </w:pPr>
     <w:rPr>
-      <w:rFonts w:ascii="Times New Roman" w:hAnsi="Times New Roman" w:eastAsia="Times New Roman" w:cs="Times New Roman"/>
-    </w:rPr>
-  </w:style>
-  <w:style w:type="paragraph" w:styleId="26" w:customStyle="1">
+      <w:rFonts w:ascii="Times New Roman" w:eastAsia="Times New Roman" w:hAnsi="Times New Roman" w:cs="Times New Roman"/>
+    </w:rPr>
+  </w:style>
+  <w:style w:type="paragraph" w:customStyle="1" w:styleId="26">
     <w:name w:val="Без интервала26"/>
     <w:rsid w:val="002C343B"/>
     <w:pPr>
       <w:spacing w:after="0" w:line="240" w:lineRule="auto"/>
     </w:pPr>
     <w:rPr>
-      <w:rFonts w:ascii="Times New Roman" w:hAnsi="Times New Roman" w:eastAsia="Times New Roman" w:cs="Times New Roman"/>
-    </w:rPr>
-  </w:style>
-  <w:style w:type="paragraph" w:styleId="27" w:customStyle="1">
+      <w:rFonts w:ascii="Times New Roman" w:eastAsia="Times New Roman" w:hAnsi="Times New Roman" w:cs="Times New Roman"/>
+    </w:rPr>
+  </w:style>
+  <w:style w:type="paragraph" w:customStyle="1" w:styleId="27">
     <w:name w:val="Без интервала27"/>
     <w:rsid w:val="002C343B"/>
     <w:pPr>
       <w:spacing w:after="0" w:line="240" w:lineRule="auto"/>
     </w:pPr>
     <w:rPr>
-      <w:rFonts w:ascii="Times New Roman" w:hAnsi="Times New Roman" w:eastAsia="Times New Roman" w:cs="Times New Roman"/>
-    </w:rPr>
-  </w:style>
-  <w:style w:type="paragraph" w:styleId="28" w:customStyle="1">
+      <w:rFonts w:ascii="Times New Roman" w:eastAsia="Times New Roman" w:hAnsi="Times New Roman" w:cs="Times New Roman"/>
+    </w:rPr>
+  </w:style>
+  <w:style w:type="paragraph" w:customStyle="1" w:styleId="28">
     <w:name w:val="Без интервала28"/>
     <w:rsid w:val="002C343B"/>
     <w:pPr>
       <w:spacing w:after="0" w:line="240" w:lineRule="auto"/>
     </w:pPr>
     <w:rPr>
-      <w:rFonts w:ascii="Times New Roman" w:hAnsi="Times New Roman" w:eastAsia="Times New Roman" w:cs="Times New Roman"/>
-    </w:rPr>
-  </w:style>
-  <w:style w:type="paragraph" w:styleId="29" w:customStyle="1">
+      <w:rFonts w:ascii="Times New Roman" w:eastAsia="Times New Roman" w:hAnsi="Times New Roman" w:cs="Times New Roman"/>
+    </w:rPr>
+  </w:style>
+  <w:style w:type="paragraph" w:customStyle="1" w:styleId="29">
     <w:name w:val="Без интервала29"/>
     <w:rsid w:val="002C343B"/>
     <w:pPr>
       <w:spacing w:after="0" w:line="240" w:lineRule="auto"/>
     </w:pPr>
     <w:rPr>
-      <w:rFonts w:ascii="Times New Roman" w:hAnsi="Times New Roman" w:eastAsia="Times New Roman" w:cs="Times New Roman"/>
-    </w:rPr>
-  </w:style>
-  <w:style w:type="paragraph" w:styleId="300" w:customStyle="1">
+      <w:rFonts w:ascii="Times New Roman" w:eastAsia="Times New Roman" w:hAnsi="Times New Roman" w:cs="Times New Roman"/>
+    </w:rPr>
+  </w:style>
+  <w:style w:type="paragraph" w:customStyle="1" w:styleId="300">
     <w:name w:val="Без интервала30"/>
     <w:rsid w:val="002C343B"/>
     <w:pPr>
       <w:spacing w:after="0" w:line="240" w:lineRule="auto"/>
     </w:pPr>
     <w:rPr>
-      <w:rFonts w:ascii="Times New Roman" w:hAnsi="Times New Roman" w:eastAsia="Times New Roman" w:cs="Times New Roman"/>
+      <w:rFonts w:ascii="Times New Roman" w:eastAsia="Times New Roman" w:hAnsi="Times New Roman" w:cs="Times New Roman"/>
       <w:szCs w:val="20"/>
     </w:rPr>
   </w:style>
-  <w:style w:type="paragraph" w:styleId="310" w:customStyle="1">
+  <w:style w:type="paragraph" w:customStyle="1" w:styleId="310">
     <w:name w:val="Без интервала31"/>
     <w:rsid w:val="002C343B"/>
     <w:pPr>
       <w:spacing w:after="0" w:line="240" w:lineRule="auto"/>
     </w:pPr>
     <w:rPr>
-      <w:rFonts w:ascii="Times New Roman" w:hAnsi="Times New Roman" w:eastAsia="Times New Roman" w:cs="Times New Roman"/>
+      <w:rFonts w:ascii="Times New Roman" w:eastAsia="Times New Roman" w:hAnsi="Times New Roman" w:cs="Times New Roman"/>
       <w:szCs w:val="20"/>
     </w:rPr>
   </w:style>
-  <w:style w:type="paragraph" w:styleId="32" w:customStyle="1">
+  <w:style w:type="paragraph" w:customStyle="1" w:styleId="32">
     <w:name w:val="Без интервала32"/>
     <w:rsid w:val="002C343B"/>
     <w:pPr>
       <w:spacing w:after="0" w:line="240" w:lineRule="auto"/>
     </w:pPr>
     <w:rPr>
-      <w:rFonts w:ascii="Times New Roman" w:hAnsi="Times New Roman" w:eastAsia="Times New Roman" w:cs="Times New Roman"/>
+      <w:rFonts w:ascii="Times New Roman" w:eastAsia="Times New Roman" w:hAnsi="Times New Roman" w:cs="Times New Roman"/>
       <w:szCs w:val="20"/>
     </w:rPr>
   </w:style>
-  <w:style w:type="paragraph" w:styleId="33" w:customStyle="1">
+  <w:style w:type="paragraph" w:customStyle="1" w:styleId="33">
     <w:name w:val="Без интервала33"/>
     <w:rsid w:val="002C343B"/>
     <w:pPr>
       <w:spacing w:after="0" w:line="240" w:lineRule="auto"/>
     </w:pPr>
     <w:rPr>
-      <w:rFonts w:ascii="Times New Roman" w:hAnsi="Times New Roman" w:eastAsia="Times New Roman" w:cs="Times New Roman"/>
+      <w:rFonts w:ascii="Times New Roman" w:eastAsia="Times New Roman" w:hAnsi="Times New Roman" w:cs="Times New Roman"/>
       <w:szCs w:val="20"/>
     </w:rPr>
   </w:style>
-  <w:style w:type="paragraph" w:styleId="34" w:customStyle="1">
+  <w:style w:type="paragraph" w:customStyle="1" w:styleId="34">
     <w:name w:val="Без интервала34"/>
     <w:rsid w:val="002C343B"/>
     <w:pPr>
       <w:spacing w:after="0" w:line="240" w:lineRule="auto"/>
     </w:pPr>
     <w:rPr>
-      <w:rFonts w:ascii="Times New Roman" w:hAnsi="Times New Roman" w:eastAsia="Times New Roman" w:cs="Times New Roman"/>
+      <w:rFonts w:ascii="Times New Roman" w:eastAsia="Times New Roman" w:hAnsi="Times New Roman" w:cs="Times New Roman"/>
       <w:szCs w:val="20"/>
     </w:rPr>
   </w:style>
-  <w:style w:type="paragraph" w:styleId="FORMATTEXT" w:customStyle="1">
+  <w:style w:type="paragraph" w:customStyle="1" w:styleId="FORMATTEXT">
     <w:name w:val=".FORMATTEXT"/>
     <w:uiPriority w:val="99"/>
     <w:rsid w:val="002C343B"/>
@@ -5238,44 +5216,44 @@
       <w:spacing w:after="0" w:line="240" w:lineRule="auto"/>
     </w:pPr>
     <w:rPr>
-      <w:rFonts w:ascii="Times New Roman" w:hAnsi="Times New Roman" w:eastAsia="Times New Roman" w:cs="Times New Roman"/>
+      <w:rFonts w:ascii="Times New Roman" w:eastAsia="Times New Roman" w:hAnsi="Times New Roman" w:cs="Times New Roman"/>
       <w:sz w:val="24"/>
       <w:szCs w:val="24"/>
       <w:lang w:eastAsia="ru-RU"/>
     </w:rPr>
   </w:style>
-  <w:style w:type="paragraph" w:styleId="35" w:customStyle="1">
+  <w:style w:type="paragraph" w:customStyle="1" w:styleId="35">
     <w:name w:val="Без интервала35"/>
     <w:rsid w:val="002C343B"/>
     <w:pPr>
       <w:spacing w:after="0" w:line="240" w:lineRule="auto"/>
     </w:pPr>
     <w:rPr>
-      <w:rFonts w:ascii="Times New Roman" w:hAnsi="Times New Roman" w:eastAsia="Times New Roman" w:cs="Times New Roman"/>
-    </w:rPr>
-  </w:style>
-  <w:style w:type="paragraph" w:styleId="36" w:customStyle="1">
+      <w:rFonts w:ascii="Times New Roman" w:eastAsia="Times New Roman" w:hAnsi="Times New Roman" w:cs="Times New Roman"/>
+    </w:rPr>
+  </w:style>
+  <w:style w:type="paragraph" w:customStyle="1" w:styleId="36">
     <w:name w:val="Без интервала36"/>
     <w:rsid w:val="002C343B"/>
     <w:pPr>
       <w:spacing w:after="0" w:line="240" w:lineRule="auto"/>
     </w:pPr>
     <w:rPr>
-      <w:rFonts w:ascii="Times New Roman" w:hAnsi="Times New Roman" w:eastAsia="Times New Roman" w:cs="Times New Roman"/>
-    </w:rPr>
-  </w:style>
-  <w:style w:type="paragraph" w:styleId="37" w:customStyle="1">
+      <w:rFonts w:ascii="Times New Roman" w:eastAsia="Times New Roman" w:hAnsi="Times New Roman" w:cs="Times New Roman"/>
+    </w:rPr>
+  </w:style>
+  <w:style w:type="paragraph" w:customStyle="1" w:styleId="37">
     <w:name w:val="Без интервала37"/>
     <w:rsid w:val="002C343B"/>
     <w:pPr>
       <w:spacing w:after="0" w:line="240" w:lineRule="auto"/>
     </w:pPr>
     <w:rPr>
-      <w:rFonts w:ascii="Times New Roman" w:hAnsi="Times New Roman" w:eastAsia="Times New Roman" w:cs="Times New Roman"/>
+      <w:rFonts w:ascii="Times New Roman" w:eastAsia="Times New Roman" w:hAnsi="Times New Roman" w:cs="Times New Roman"/>
       <w:szCs w:val="20"/>
     </w:rPr>
   </w:style>
-  <w:style w:type="character" w:styleId="82" w:customStyle="1">
+  <w:style w:type="character" w:customStyle="1" w:styleId="82">
     <w:name w:val="Обычный + 8 пт2"/>
     <w:uiPriority w:val="99"/>
     <w:locked/>
@@ -5284,156 +5262,156 @@
       <w:lang w:eastAsia="en-US"/>
     </w:rPr>
   </w:style>
-  <w:style w:type="paragraph" w:styleId="38" w:customStyle="1">
+  <w:style w:type="paragraph" w:customStyle="1" w:styleId="38">
     <w:name w:val="Без интервала38"/>
     <w:rsid w:val="002C343B"/>
     <w:pPr>
       <w:spacing w:after="0" w:line="240" w:lineRule="auto"/>
     </w:pPr>
     <w:rPr>
-      <w:rFonts w:ascii="Times New Roman" w:hAnsi="Times New Roman" w:eastAsia="Times New Roman" w:cs="Times New Roman"/>
+      <w:rFonts w:ascii="Times New Roman" w:eastAsia="Times New Roman" w:hAnsi="Times New Roman" w:cs="Times New Roman"/>
       <w:szCs w:val="20"/>
     </w:rPr>
   </w:style>
-  <w:style w:type="paragraph" w:styleId="39" w:customStyle="1">
+  <w:style w:type="paragraph" w:customStyle="1" w:styleId="39">
     <w:name w:val="Без интервала39"/>
     <w:rsid w:val="002C343B"/>
     <w:pPr>
       <w:spacing w:after="0" w:line="240" w:lineRule="auto"/>
     </w:pPr>
     <w:rPr>
-      <w:rFonts w:ascii="Times New Roman" w:hAnsi="Times New Roman" w:eastAsia="Times New Roman" w:cs="Times New Roman"/>
+      <w:rFonts w:ascii="Times New Roman" w:eastAsia="Times New Roman" w:hAnsi="Times New Roman" w:cs="Times New Roman"/>
       <w:szCs w:val="20"/>
     </w:rPr>
   </w:style>
-  <w:style w:type="paragraph" w:styleId="400" w:customStyle="1">
+  <w:style w:type="paragraph" w:customStyle="1" w:styleId="400">
     <w:name w:val="Без интервала40"/>
     <w:rsid w:val="002C343B"/>
     <w:pPr>
       <w:spacing w:after="0" w:line="240" w:lineRule="auto"/>
     </w:pPr>
     <w:rPr>
-      <w:rFonts w:ascii="Times New Roman" w:hAnsi="Times New Roman" w:eastAsia="Times New Roman" w:cs="Times New Roman"/>
+      <w:rFonts w:ascii="Times New Roman" w:eastAsia="Times New Roman" w:hAnsi="Times New Roman" w:cs="Times New Roman"/>
       <w:szCs w:val="20"/>
     </w:rPr>
   </w:style>
-  <w:style w:type="paragraph" w:styleId="410" w:customStyle="1">
+  <w:style w:type="paragraph" w:customStyle="1" w:styleId="410">
     <w:name w:val="Без интервала41"/>
     <w:rsid w:val="002C343B"/>
     <w:pPr>
       <w:spacing w:after="0" w:line="240" w:lineRule="auto"/>
     </w:pPr>
     <w:rPr>
-      <w:rFonts w:ascii="Times New Roman" w:hAnsi="Times New Roman" w:eastAsia="Times New Roman" w:cs="Times New Roman"/>
+      <w:rFonts w:ascii="Times New Roman" w:eastAsia="Times New Roman" w:hAnsi="Times New Roman" w:cs="Times New Roman"/>
       <w:szCs w:val="20"/>
     </w:rPr>
   </w:style>
-  <w:style w:type="paragraph" w:styleId="42" w:customStyle="1">
+  <w:style w:type="paragraph" w:customStyle="1" w:styleId="42">
     <w:name w:val="Без интервала42"/>
     <w:rsid w:val="002C343B"/>
     <w:pPr>
       <w:spacing w:after="0" w:line="240" w:lineRule="auto"/>
     </w:pPr>
     <w:rPr>
-      <w:rFonts w:ascii="Times New Roman" w:hAnsi="Times New Roman" w:eastAsia="Times New Roman" w:cs="Times New Roman"/>
+      <w:rFonts w:ascii="Times New Roman" w:eastAsia="Times New Roman" w:hAnsi="Times New Roman" w:cs="Times New Roman"/>
       <w:szCs w:val="20"/>
     </w:rPr>
   </w:style>
-  <w:style w:type="paragraph" w:styleId="43" w:customStyle="1">
+  <w:style w:type="paragraph" w:customStyle="1" w:styleId="43">
     <w:name w:val="Без интервала43"/>
     <w:rsid w:val="002C343B"/>
     <w:pPr>
       <w:spacing w:after="0" w:line="240" w:lineRule="auto"/>
     </w:pPr>
     <w:rPr>
-      <w:rFonts w:ascii="Times New Roman" w:hAnsi="Times New Roman" w:eastAsia="Times New Roman" w:cs="Times New Roman"/>
+      <w:rFonts w:ascii="Times New Roman" w:eastAsia="Times New Roman" w:hAnsi="Times New Roman" w:cs="Times New Roman"/>
       <w:szCs w:val="20"/>
     </w:rPr>
   </w:style>
-  <w:style w:type="paragraph" w:styleId="44" w:customStyle="1">
+  <w:style w:type="paragraph" w:customStyle="1" w:styleId="44">
     <w:name w:val="Без интервала44"/>
     <w:rsid w:val="002C343B"/>
     <w:pPr>
       <w:spacing w:after="0" w:line="240" w:lineRule="auto"/>
     </w:pPr>
     <w:rPr>
-      <w:rFonts w:ascii="Times New Roman" w:hAnsi="Times New Roman" w:eastAsia="Times New Roman" w:cs="Times New Roman"/>
+      <w:rFonts w:ascii="Times New Roman" w:eastAsia="Times New Roman" w:hAnsi="Times New Roman" w:cs="Times New Roman"/>
       <w:szCs w:val="20"/>
     </w:rPr>
   </w:style>
-  <w:style w:type="character" w:styleId="610" w:customStyle="1">
+  <w:style w:type="character" w:customStyle="1" w:styleId="610">
     <w:name w:val="Знак Знак61"/>
     <w:uiPriority w:val="99"/>
     <w:rsid w:val="002C343B"/>
     <w:rPr>
-      <w:rFonts w:ascii="Cambria" w:hAnsi="Cambria" w:eastAsia="Times New Roman"/>
+      <w:rFonts w:ascii="Cambria" w:eastAsia="Times New Roman" w:hAnsi="Cambria"/>
       <w:sz w:val="22"/>
       <w:lang w:eastAsia="en-US"/>
     </w:rPr>
   </w:style>
-  <w:style w:type="paragraph" w:styleId="45" w:customStyle="1">
+  <w:style w:type="paragraph" w:customStyle="1" w:styleId="45">
     <w:name w:val="Без интервала45"/>
     <w:rsid w:val="002C343B"/>
     <w:pPr>
       <w:spacing w:after="0" w:line="240" w:lineRule="auto"/>
     </w:pPr>
     <w:rPr>
-      <w:rFonts w:ascii="Times New Roman" w:hAnsi="Times New Roman" w:eastAsia="Times New Roman" w:cs="Times New Roman"/>
+      <w:rFonts w:ascii="Times New Roman" w:eastAsia="Times New Roman" w:hAnsi="Times New Roman" w:cs="Times New Roman"/>
       <w:szCs w:val="20"/>
     </w:rPr>
   </w:style>
-  <w:style w:type="paragraph" w:styleId="46" w:customStyle="1">
+  <w:style w:type="paragraph" w:customStyle="1" w:styleId="46">
     <w:name w:val="Без интервала46"/>
     <w:rsid w:val="002C343B"/>
     <w:pPr>
       <w:spacing w:after="0" w:line="240" w:lineRule="auto"/>
     </w:pPr>
     <w:rPr>
-      <w:rFonts w:ascii="Times New Roman" w:hAnsi="Times New Roman" w:eastAsia="Times New Roman" w:cs="Times New Roman"/>
+      <w:rFonts w:ascii="Times New Roman" w:eastAsia="Times New Roman" w:hAnsi="Times New Roman" w:cs="Times New Roman"/>
       <w:szCs w:val="20"/>
     </w:rPr>
   </w:style>
-  <w:style w:type="paragraph" w:styleId="47" w:customStyle="1">
+  <w:style w:type="paragraph" w:customStyle="1" w:styleId="47">
     <w:name w:val="Без интервала47"/>
     <w:rsid w:val="002C343B"/>
     <w:pPr>
       <w:spacing w:after="0" w:line="240" w:lineRule="auto"/>
     </w:pPr>
     <w:rPr>
-      <w:rFonts w:ascii="Times New Roman" w:hAnsi="Times New Roman" w:eastAsia="Times New Roman" w:cs="Times New Roman"/>
+      <w:rFonts w:ascii="Times New Roman" w:eastAsia="Times New Roman" w:hAnsi="Times New Roman" w:cs="Times New Roman"/>
       <w:szCs w:val="20"/>
     </w:rPr>
   </w:style>
-  <w:style w:type="paragraph" w:styleId="48" w:customStyle="1">
+  <w:style w:type="paragraph" w:customStyle="1" w:styleId="48">
     <w:name w:val="Без интервала48"/>
     <w:rsid w:val="002C343B"/>
     <w:pPr>
       <w:spacing w:after="0" w:line="240" w:lineRule="auto"/>
     </w:pPr>
     <w:rPr>
-      <w:rFonts w:ascii="Times New Roman" w:hAnsi="Times New Roman" w:eastAsia="Times New Roman" w:cs="Times New Roman"/>
+      <w:rFonts w:ascii="Times New Roman" w:eastAsia="Times New Roman" w:hAnsi="Times New Roman" w:cs="Times New Roman"/>
       <w:szCs w:val="20"/>
     </w:rPr>
   </w:style>
-  <w:style w:type="paragraph" w:styleId="49" w:customStyle="1">
+  <w:style w:type="paragraph" w:customStyle="1" w:styleId="49">
     <w:name w:val="Без интервала49"/>
     <w:rsid w:val="002C343B"/>
     <w:pPr>
       <w:spacing w:after="0" w:line="240" w:lineRule="auto"/>
     </w:pPr>
     <w:rPr>
-      <w:rFonts w:ascii="Times New Roman" w:hAnsi="Times New Roman" w:eastAsia="Times New Roman" w:cs="Times New Roman"/>
+      <w:rFonts w:ascii="Times New Roman" w:eastAsia="Times New Roman" w:hAnsi="Times New Roman" w:cs="Times New Roman"/>
       <w:szCs w:val="20"/>
     </w:rPr>
   </w:style>
-  <w:style w:type="paragraph" w:styleId="500" w:customStyle="1">
+  <w:style w:type="paragraph" w:customStyle="1" w:styleId="500">
     <w:name w:val="Без интервала50"/>
     <w:rsid w:val="002C343B"/>
     <w:pPr>
       <w:spacing w:after="0" w:line="240" w:lineRule="auto"/>
     </w:pPr>
     <w:rPr>
-      <w:rFonts w:ascii="Times New Roman" w:hAnsi="Times New Roman" w:eastAsia="Times New Roman" w:cs="Times New Roman"/>
+      <w:rFonts w:ascii="Times New Roman" w:eastAsia="Times New Roman" w:hAnsi="Times New Roman" w:cs="Times New Roman"/>
       <w:szCs w:val="20"/>
     </w:rPr>
   </w:style>
@@ -5447,18 +5425,18 @@
       <w:color w:val="808080"/>
     </w:rPr>
   </w:style>
-  <w:style w:type="paragraph" w:styleId="510" w:customStyle="1">
+  <w:style w:type="paragraph" w:customStyle="1" w:styleId="510">
     <w:name w:val="Без интервала51"/>
     <w:rsid w:val="002C343B"/>
     <w:pPr>
       <w:spacing w:after="0" w:line="240" w:lineRule="auto"/>
     </w:pPr>
     <w:rPr>
-      <w:rFonts w:ascii="Times New Roman" w:hAnsi="Times New Roman" w:eastAsia="Times New Roman" w:cs="Times New Roman"/>
+      <w:rFonts w:ascii="Times New Roman" w:eastAsia="Times New Roman" w:hAnsi="Times New Roman" w:cs="Times New Roman"/>
       <w:szCs w:val="20"/>
     </w:rPr>
   </w:style>
-  <w:style w:type="paragraph" w:styleId="Heading" w:customStyle="1">
+  <w:style w:type="paragraph" w:customStyle="1" w:styleId="Heading">
     <w:name w:val="Heading"/>
     <w:rsid w:val="002C343B"/>
     <w:pPr>
@@ -5470,18 +5448,18 @@
       <w:spacing w:after="0" w:line="240" w:lineRule="auto"/>
     </w:pPr>
     <w:rPr>
-      <w:rFonts w:ascii="Arial" w:hAnsi="Arial" w:eastAsia="Times New Roman" w:cs="Times New Roman"/>
+      <w:rFonts w:ascii="Arial" w:eastAsia="Times New Roman" w:hAnsi="Arial" w:cs="Times New Roman"/>
       <w:b/>
       <w:szCs w:val="20"/>
       <w:lang w:eastAsia="ru-RU"/>
     </w:rPr>
   </w:style>
-  <w:style w:type="character" w:styleId="fontstyle01" w:customStyle="1">
+  <w:style w:type="character" w:customStyle="1" w:styleId="fontstyle01">
     <w:name w:val="fontstyle01"/>
     <w:basedOn w:val="a0"/>
     <w:rsid w:val="002C343B"/>
     <w:rPr>
-      <w:rFonts w:hint="default" w:ascii="GOSTCommonItalic" w:hAnsi="GOSTCommonItalic"/>
+      <w:rFonts w:ascii="GOSTCommonItalic" w:hAnsi="GOSTCommonItalic" w:hint="default"/>
       <w:i/>
       <w:iCs/>
       <w:color w:val="000000"/>
@@ -5489,51 +5467,51 @@
       <w:szCs w:val="28"/>
     </w:rPr>
   </w:style>
-  <w:style w:type="character" w:styleId="eop" w:customStyle="1">
+  <w:style w:type="character" w:customStyle="1" w:styleId="eop">
     <w:name w:val="eop"/>
     <w:basedOn w:val="a0"/>
     <w:rsid w:val="002C343B"/>
   </w:style>
-  <w:style w:type="paragraph" w:styleId="1a" w:customStyle="1">
+  <w:style w:type="paragraph" w:customStyle="1" w:styleId="1a">
     <w:name w:val="Обычный1"/>
     <w:rsid w:val="002C343B"/>
     <w:pPr>
       <w:spacing w:before="100" w:beforeAutospacing="1" w:after="100" w:afterAutospacing="1" w:line="273" w:lineRule="auto"/>
     </w:pPr>
     <w:rPr>
-      <w:rFonts w:ascii="Times New Roman" w:hAnsi="Times New Roman" w:eastAsia="Times New Roman" w:cs="Times New Roman"/>
+      <w:rFonts w:ascii="Times New Roman" w:eastAsia="Times New Roman" w:hAnsi="Times New Roman" w:cs="Times New Roman"/>
       <w:sz w:val="24"/>
       <w:szCs w:val="24"/>
       <w:lang w:eastAsia="ru-RU"/>
     </w:rPr>
   </w:style>
-  <w:style w:type="paragraph" w:styleId="2a" w:customStyle="1">
+  <w:style w:type="paragraph" w:customStyle="1" w:styleId="2a">
     <w:name w:val="Обычный2"/>
     <w:rsid w:val="002C343B"/>
     <w:pPr>
       <w:spacing w:before="100" w:beforeAutospacing="1" w:after="100" w:afterAutospacing="1" w:line="273" w:lineRule="auto"/>
     </w:pPr>
     <w:rPr>
-      <w:rFonts w:ascii="Calibri" w:hAnsi="Calibri" w:eastAsia="SimSun" w:cs="Times New Roman"/>
+      <w:rFonts w:ascii="Calibri" w:eastAsia="SimSun" w:hAnsi="Calibri" w:cs="Times New Roman"/>
       <w:sz w:val="24"/>
       <w:szCs w:val="24"/>
       <w:lang w:eastAsia="ru-RU"/>
     </w:rPr>
   </w:style>
-  <w:style w:type="paragraph" w:styleId="3a" w:customStyle="1">
+  <w:style w:type="paragraph" w:customStyle="1" w:styleId="3a">
     <w:name w:val="Обычный3"/>
     <w:rsid w:val="002C343B"/>
     <w:pPr>
       <w:spacing w:before="100" w:beforeAutospacing="1" w:after="100" w:afterAutospacing="1" w:line="273" w:lineRule="auto"/>
     </w:pPr>
     <w:rPr>
-      <w:rFonts w:ascii="Times New Roman" w:hAnsi="Times New Roman" w:eastAsia="SimHei" w:cs="Times New Roman"/>
+      <w:rFonts w:ascii="Times New Roman" w:eastAsia="SimHei" w:hAnsi="Times New Roman" w:cs="Times New Roman"/>
       <w:sz w:val="24"/>
       <w:szCs w:val="24"/>
       <w:lang w:eastAsia="ru-RU"/>
     </w:rPr>
   </w:style>
-  <w:style w:type="paragraph" w:styleId="52" w:customStyle="1">
+  <w:style w:type="paragraph" w:customStyle="1" w:styleId="52">
     <w:name w:val="Без интервала52"/>
     <w:basedOn w:val="a"/>
     <w:rsid w:val="0032735D"/>
@@ -5541,64 +5519,64 @@
       <w:spacing w:after="0" w:line="240" w:lineRule="auto"/>
     </w:pPr>
     <w:rPr>
-      <w:rFonts w:ascii="Times New Roman" w:hAnsi="Times New Roman" w:eastAsia="Times New Roman" w:cs="Times New Roman"/>
+      <w:rFonts w:ascii="Times New Roman" w:eastAsia="Times New Roman" w:hAnsi="Times New Roman" w:cs="Times New Roman"/>
       <w:sz w:val="24"/>
       <w:szCs w:val="24"/>
     </w:rPr>
   </w:style>
-  <w:style w:type="paragraph" w:styleId="4a" w:customStyle="1">
+  <w:style w:type="paragraph" w:customStyle="1" w:styleId="4a">
     <w:name w:val="Обычный4"/>
     <w:rsid w:val="0032735D"/>
     <w:pPr>
       <w:spacing w:before="100" w:beforeAutospacing="1" w:after="100" w:afterAutospacing="1" w:line="273" w:lineRule="auto"/>
     </w:pPr>
     <w:rPr>
-      <w:rFonts w:ascii="Calibri" w:hAnsi="Calibri" w:eastAsia="SimSun" w:cs="Times New Roman"/>
+      <w:rFonts w:ascii="Calibri" w:eastAsia="SimSun" w:hAnsi="Calibri" w:cs="Times New Roman"/>
       <w:sz w:val="24"/>
       <w:szCs w:val="24"/>
       <w:lang w:eastAsia="ru-RU"/>
     </w:rPr>
   </w:style>
-  <w:style w:type="paragraph" w:styleId="53" w:customStyle="1">
+  <w:style w:type="paragraph" w:customStyle="1" w:styleId="53">
     <w:name w:val="Обычный5"/>
     <w:rsid w:val="0032735D"/>
     <w:pPr>
       <w:spacing w:before="100" w:beforeAutospacing="1" w:after="100" w:afterAutospacing="1" w:line="273" w:lineRule="auto"/>
     </w:pPr>
     <w:rPr>
-      <w:rFonts w:ascii="Times New Roman" w:hAnsi="Times New Roman" w:eastAsia="SimHei" w:cs="Times New Roman"/>
+      <w:rFonts w:ascii="Times New Roman" w:eastAsia="SimHei" w:hAnsi="Times New Roman" w:cs="Times New Roman"/>
       <w:sz w:val="24"/>
       <w:szCs w:val="24"/>
       <w:lang w:eastAsia="ru-RU"/>
     </w:rPr>
   </w:style>
-  <w:style w:type="paragraph" w:styleId="62" w:customStyle="1">
+  <w:style w:type="paragraph" w:customStyle="1" w:styleId="62">
     <w:name w:val="Обычный6"/>
     <w:rsid w:val="0032735D"/>
     <w:pPr>
       <w:spacing w:before="100" w:beforeAutospacing="1" w:after="100" w:afterAutospacing="1" w:line="273" w:lineRule="auto"/>
     </w:pPr>
     <w:rPr>
-      <w:rFonts w:ascii="Times New Roman" w:hAnsi="Times New Roman" w:eastAsia="Times New Roman" w:cs="Times New Roman"/>
+      <w:rFonts w:ascii="Times New Roman" w:eastAsia="Times New Roman" w:hAnsi="Times New Roman" w:cs="Times New Roman"/>
       <w:sz w:val="24"/>
       <w:szCs w:val="24"/>
       <w:lang w:eastAsia="ru-RU"/>
     </w:rPr>
   </w:style>
-  <w:style w:type="paragraph" w:styleId="72" w:customStyle="1">
+  <w:style w:type="paragraph" w:customStyle="1" w:styleId="72">
     <w:name w:val="Обычный7"/>
     <w:rsid w:val="0032735D"/>
     <w:pPr>
       <w:spacing w:before="100" w:beforeAutospacing="1" w:after="100" w:afterAutospacing="1" w:line="273" w:lineRule="auto"/>
     </w:pPr>
     <w:rPr>
-      <w:rFonts w:ascii="Times New Roman" w:hAnsi="Times New Roman" w:eastAsia="SimHei" w:cs="Times New Roman"/>
+      <w:rFonts w:ascii="Times New Roman" w:eastAsia="SimHei" w:hAnsi="Times New Roman" w:cs="Times New Roman"/>
       <w:sz w:val="24"/>
       <w:szCs w:val="24"/>
       <w:lang w:eastAsia="ru-RU"/>
     </w:rPr>
   </w:style>
-  <w:style w:type="paragraph" w:styleId="headertext" w:customStyle="1">
+  <w:style w:type="paragraph" w:customStyle="1" w:styleId="headertext">
     <w:name w:val="headertext"/>
     <w:basedOn w:val="a"/>
     <w:rsid w:val="0032735D"/>
@@ -5606,17 +5584,17 @@
       <w:spacing w:before="100" w:beforeAutospacing="1" w:after="100" w:afterAutospacing="1" w:line="240" w:lineRule="auto"/>
     </w:pPr>
     <w:rPr>
-      <w:rFonts w:ascii="Times New Roman" w:hAnsi="Times New Roman" w:eastAsia="Times New Roman" w:cs="Times New Roman"/>
+      <w:rFonts w:ascii="Times New Roman" w:eastAsia="Times New Roman" w:hAnsi="Times New Roman" w:cs="Times New Roman"/>
       <w:sz w:val="24"/>
       <w:szCs w:val="24"/>
     </w:rPr>
   </w:style>
-  <w:style w:type="character" w:styleId="extendedtext-short" w:customStyle="1">
+  <w:style w:type="character" w:customStyle="1" w:styleId="extendedtext-short">
     <w:name w:val="extendedtext-short"/>
     <w:basedOn w:val="a0"/>
     <w:rsid w:val="00E706B7"/>
   </w:style>
-  <w:style w:type="character" w:styleId="stat12" w:customStyle="1">
+  <w:style w:type="character" w:customStyle="1" w:styleId="stat12">
     <w:name w:val="stat12"/>
     <w:rsid w:val="00303AEF"/>
   </w:style>

</xml_diff>